<commit_message>
Updated report and added pdf file
</commit_message>
<xml_diff>
--- a/Report.docx
+++ b/Report.docx
@@ -14,7 +14,7 @@
           <v:rect id="rectole0000000000" o:spid="_x0000_i1025" style="width:112.7pt;height:112.7pt" o:ole="" o:preferrelative="t" stroked="f">
             <v:imagedata r:id="rId8" o:title=""/>
           </v:rect>
-          <o:OLEObject Type="Embed" ProgID="StaticMetafile" ShapeID="rectole0000000000" DrawAspect="Content" ObjectID="_1840532652" r:id="rId9"/>
+          <o:OLEObject Type="Embed" ProgID="StaticMetafile" ShapeID="rectole0000000000" DrawAspect="Content" ObjectID="_1840559768" r:id="rId9"/>
         </w:object>
       </w:r>
     </w:p>
@@ -907,7 +907,7 @@
         <w:jc w:val="center"/>
         <w:rPr>
           <w:rFonts w:ascii="Aptos" w:eastAsia="Aptos" w:hAnsi="Aptos" w:cs="Aptos"/>
-          <w:lang w:val="en-GB"/>
+          <w:lang w:val="el-GR"/>
         </w:rPr>
       </w:pPr>
     </w:p>
@@ -916,7 +916,7 @@
         <w:jc w:val="center"/>
         <w:rPr>
           <w:rFonts w:ascii="Aptos" w:eastAsia="Aptos" w:hAnsi="Aptos" w:cs="Aptos"/>
-          <w:lang w:val="en-GB"/>
+          <w:lang w:val="el-GR"/>
         </w:rPr>
       </w:pPr>
     </w:p>
@@ -1735,6 +1735,13 @@
     </w:p>
     <w:sdt>
       <w:sdtPr>
+        <w:rPr>
+          <w:rFonts w:asciiTheme="minorHAnsi" w:eastAsiaTheme="minorEastAsia" w:hAnsiTheme="minorHAnsi" w:cstheme="minorBidi"/>
+          <w:color w:val="auto"/>
+          <w:kern w:val="2"/>
+          <w:sz w:val="24"/>
+          <w:szCs w:val="24"/>
+        </w:rPr>
         <w:id w:val="-508836438"/>
         <w:docPartObj>
           <w:docPartGallery w:val="Table of Contents"/>
@@ -1743,14 +1750,9 @@
       </w:sdtPr>
       <w:sdtEndPr>
         <w:rPr>
-          <w:rFonts w:asciiTheme="minorHAnsi" w:eastAsiaTheme="minorEastAsia" w:hAnsiTheme="minorHAnsi" w:cstheme="minorBidi"/>
           <w:b/>
           <w:bCs/>
           <w:noProof/>
-          <w:color w:val="auto"/>
-          <w:kern w:val="2"/>
-          <w:sz w:val="24"/>
-          <w:szCs w:val="24"/>
         </w:rPr>
       </w:sdtEndPr>
       <w:sdtContent>
@@ -7128,7 +7130,7 @@
           <w:rFonts w:ascii="Times New Roman" w:eastAsia="Calibri" w:hAnsi="Times New Roman" w:cs="Times New Roman"/>
           <w:b/>
           <w:bCs/>
-          <w:lang w:val="en-GB"/>
+          <w:lang w:val="el-GR"/>
         </w:rPr>
       </w:pPr>
       <w:r>
@@ -7146,7 +7148,7 @@
       <w:pPr>
         <w:rPr>
           <w:rFonts w:ascii="Times New Roman" w:hAnsi="Times New Roman" w:cs="Times New Roman"/>
-          <w:lang w:val="en-GB"/>
+          <w:lang w:val="el-GR"/>
         </w:rPr>
       </w:pPr>
     </w:p>
@@ -7620,7 +7622,7 @@
           <v:rect id="rectole0000000001" o:spid="_x0000_i1026" style="width:432.45pt;height:215.55pt" o:ole="" o:preferrelative="t" stroked="f">
             <v:imagedata r:id="rId10" o:title=""/>
           </v:rect>
-          <o:OLEObject Type="Embed" ProgID="StaticMetafile" ShapeID="rectole0000000001" DrawAspect="Content" ObjectID="_1840532653" r:id="rId11"/>
+          <o:OLEObject Type="Embed" ProgID="StaticMetafile" ShapeID="rectole0000000001" DrawAspect="Content" ObjectID="_1840559769" r:id="rId11"/>
         </w:object>
       </w:r>
     </w:p>
@@ -7778,34 +7780,34 @@
         <w:rPr>
           <w:rFonts w:ascii="Aptos" w:eastAsia="Aptos" w:hAnsi="Aptos" w:cs="Aptos"/>
           <w:b/>
-          <w:lang w:val="en-GB"/>
-        </w:rPr>
-      </w:pPr>
-    </w:p>
-    <w:p>
-      <w:pPr>
-        <w:rPr>
-          <w:rFonts w:ascii="Aptos" w:eastAsia="Aptos" w:hAnsi="Aptos" w:cs="Aptos"/>
-          <w:b/>
-          <w:lang w:val="en-GB"/>
-        </w:rPr>
-      </w:pPr>
-    </w:p>
-    <w:p>
-      <w:pPr>
-        <w:rPr>
-          <w:rFonts w:ascii="Aptos" w:eastAsia="Aptos" w:hAnsi="Aptos" w:cs="Aptos"/>
-          <w:b/>
-          <w:lang w:val="en-GB"/>
-        </w:rPr>
-      </w:pPr>
-    </w:p>
-    <w:p>
-      <w:pPr>
-        <w:rPr>
-          <w:rFonts w:ascii="Aptos" w:eastAsia="Aptos" w:hAnsi="Aptos" w:cs="Aptos"/>
-          <w:b/>
-          <w:lang w:val="en-GB"/>
+          <w:lang w:val="el-GR"/>
+        </w:rPr>
+      </w:pPr>
+    </w:p>
+    <w:p>
+      <w:pPr>
+        <w:rPr>
+          <w:rFonts w:ascii="Aptos" w:eastAsia="Aptos" w:hAnsi="Aptos" w:cs="Aptos"/>
+          <w:b/>
+          <w:lang w:val="el-GR"/>
+        </w:rPr>
+      </w:pPr>
+    </w:p>
+    <w:p>
+      <w:pPr>
+        <w:rPr>
+          <w:rFonts w:ascii="Aptos" w:eastAsia="Aptos" w:hAnsi="Aptos" w:cs="Aptos"/>
+          <w:b/>
+          <w:lang w:val="el-GR"/>
+        </w:rPr>
+      </w:pPr>
+    </w:p>
+    <w:p>
+      <w:pPr>
+        <w:rPr>
+          <w:rFonts w:ascii="Aptos" w:eastAsia="Aptos" w:hAnsi="Aptos" w:cs="Aptos"/>
+          <w:b/>
+          <w:lang w:val="el-GR"/>
         </w:rPr>
       </w:pPr>
     </w:p>
@@ -8707,15 +8709,15 @@
       <w:pPr>
         <w:rPr>
           <w:rFonts w:ascii="Aptos" w:eastAsia="Aptos" w:hAnsi="Aptos" w:cs="Aptos"/>
-          <w:lang w:val="en-GB"/>
-        </w:rPr>
-      </w:pPr>
-    </w:p>
-    <w:p>
-      <w:pPr>
-        <w:rPr>
-          <w:rFonts w:ascii="Aptos" w:eastAsia="Aptos" w:hAnsi="Aptos" w:cs="Aptos"/>
-          <w:lang w:val="en-GB"/>
+          <w:lang w:val="el-GR"/>
+        </w:rPr>
+      </w:pPr>
+    </w:p>
+    <w:p>
+      <w:pPr>
+        <w:rPr>
+          <w:rFonts w:ascii="Aptos" w:eastAsia="Aptos" w:hAnsi="Aptos" w:cs="Aptos"/>
+          <w:lang w:val="el-GR"/>
         </w:rPr>
       </w:pPr>
     </w:p>
@@ -8758,7 +8760,7 @@
           <w:rFonts w:ascii="Times New Roman" w:eastAsia="Calibri" w:hAnsi="Times New Roman" w:cs="Times New Roman"/>
           <w:b/>
           <w:bCs/>
-          <w:lang w:val="en-GB"/>
+          <w:lang w:val="el-GR"/>
         </w:rPr>
       </w:pPr>
       <w:bookmarkStart w:id="2" w:name="_Toc229914633"/>
@@ -8778,7 +8780,7 @@
       <w:pPr>
         <w:rPr>
           <w:rFonts w:ascii="Times New Roman" w:hAnsi="Times New Roman" w:cs="Times New Roman"/>
-          <w:lang w:val="en-GB"/>
+          <w:lang w:val="el-GR"/>
         </w:rPr>
       </w:pPr>
     </w:p>
@@ -9943,7 +9945,7 @@
           <v:rect id="rectole0000000002" o:spid="_x0000_i1027" style="width:432.85pt;height:235.7pt" o:ole="" o:preferrelative="t" stroked="f">
             <v:imagedata r:id="rId12" o:title=""/>
           </v:rect>
-          <o:OLEObject Type="Embed" ProgID="StaticMetafile" ShapeID="rectole0000000002" DrawAspect="Content" ObjectID="_1840532654" r:id="rId13"/>
+          <o:OLEObject Type="Embed" ProgID="StaticMetafile" ShapeID="rectole0000000002" DrawAspect="Content" ObjectID="_1840559770" r:id="rId13"/>
         </w:object>
       </w:r>
     </w:p>
@@ -10089,7 +10091,7 @@
           <w:rFonts w:ascii="Times New Roman" w:eastAsia="Calibri" w:hAnsi="Times New Roman" w:cs="Times New Roman"/>
           <w:b/>
           <w:bCs/>
-          <w:lang w:val="en-GB"/>
+          <w:lang w:val="el-GR"/>
         </w:rPr>
       </w:pPr>
       <w:bookmarkStart w:id="3" w:name="_Toc229914634"/>
@@ -10109,7 +10111,7 @@
       <w:pPr>
         <w:rPr>
           <w:rFonts w:ascii="Times New Roman" w:hAnsi="Times New Roman" w:cs="Times New Roman"/>
-          <w:lang w:val="en-GB"/>
+          <w:lang w:val="el-GR"/>
         </w:rPr>
       </w:pPr>
     </w:p>
@@ -11047,14 +11049,6 @@
         </w:rPr>
         <w:t>.</w:t>
       </w:r>
-    </w:p>
-    <w:p>
-      <w:pPr>
-        <w:rPr>
-          <w:rFonts w:ascii="Times New Roman" w:eastAsia="Aptos" w:hAnsi="Times New Roman" w:cs="Times New Roman"/>
-          <w:lang w:val="el-GR"/>
-        </w:rPr>
-      </w:pPr>
     </w:p>
     <w:p>
       <w:pPr>
@@ -11170,7 +11164,7 @@
           <v:rect id="rectole0000000003" o:spid="_x0000_i1028" style="width:432.85pt;height:278.15pt" o:ole="" o:preferrelative="t" stroked="f">
             <v:imagedata r:id="rId14" o:title=""/>
           </v:rect>
-          <o:OLEObject Type="Embed" ProgID="StaticMetafile" ShapeID="rectole0000000003" DrawAspect="Content" ObjectID="_1840532655" r:id="rId15"/>
+          <o:OLEObject Type="Embed" ProgID="StaticMetafile" ShapeID="rectole0000000003" DrawAspect="Content" ObjectID="_1840559771" r:id="rId15"/>
         </w:object>
       </w:r>
     </w:p>
@@ -11291,15 +11285,15 @@
       <w:pPr>
         <w:rPr>
           <w:rFonts w:ascii="Aptos" w:eastAsia="Aptos" w:hAnsi="Aptos" w:cs="Aptos"/>
-          <w:lang w:val="en-GB"/>
-        </w:rPr>
-      </w:pPr>
-    </w:p>
-    <w:p>
-      <w:pPr>
-        <w:rPr>
-          <w:rFonts w:ascii="Aptos" w:eastAsia="Aptos" w:hAnsi="Aptos" w:cs="Aptos"/>
-          <w:lang w:val="en-GB"/>
+          <w:lang w:val="el-GR"/>
+        </w:rPr>
+      </w:pPr>
+    </w:p>
+    <w:p>
+      <w:pPr>
+        <w:rPr>
+          <w:rFonts w:ascii="Aptos" w:eastAsia="Aptos" w:hAnsi="Aptos" w:cs="Aptos"/>
+          <w:lang w:val="el-GR"/>
         </w:rPr>
       </w:pPr>
     </w:p>
@@ -11326,7 +11320,7 @@
           <w:rFonts w:ascii="Times New Roman" w:eastAsia="Calibri" w:hAnsi="Times New Roman" w:cs="Times New Roman"/>
           <w:b/>
           <w:bCs/>
-          <w:lang w:val="en-GB"/>
+          <w:lang w:val="el-GR"/>
         </w:rPr>
       </w:pPr>
       <w:bookmarkStart w:id="4" w:name="_Toc229914635"/>
@@ -11346,7 +11340,7 @@
       <w:pPr>
         <w:rPr>
           <w:rFonts w:ascii="Times New Roman" w:hAnsi="Times New Roman" w:cs="Times New Roman"/>
-          <w:lang w:val="en-GB"/>
+          <w:lang w:val="el-GR"/>
         </w:rPr>
       </w:pPr>
     </w:p>
@@ -12156,7 +12150,7 @@
           <v:rect id="rectole0000000004" o:spid="_x0000_i1029" style="width:432.85pt;height:392.55pt" o:ole="" o:preferrelative="t" stroked="f">
             <v:imagedata r:id="rId16" o:title=""/>
           </v:rect>
-          <o:OLEObject Type="Embed" ProgID="StaticMetafile" ShapeID="rectole0000000004" DrawAspect="Content" ObjectID="_1840532656" r:id="rId17"/>
+          <o:OLEObject Type="Embed" ProgID="StaticMetafile" ShapeID="rectole0000000004" DrawAspect="Content" ObjectID="_1840559772" r:id="rId17"/>
         </w:object>
       </w:r>
     </w:p>
@@ -12251,7 +12245,7 @@
           <w:rFonts w:ascii="Times New Roman" w:eastAsia="Calibri" w:hAnsi="Times New Roman" w:cs="Times New Roman"/>
           <w:b/>
           <w:bCs/>
-          <w:lang w:val="en-GB"/>
+          <w:lang w:val="el-GR"/>
         </w:rPr>
       </w:pPr>
       <w:bookmarkStart w:id="5" w:name="_Toc229914636"/>
@@ -12373,7 +12367,7 @@
       <w:pPr>
         <w:rPr>
           <w:rFonts w:ascii="Times New Roman" w:hAnsi="Times New Roman" w:cs="Times New Roman"/>
-          <w:lang w:val="en-GB"/>
+          <w:lang w:val="el-GR"/>
         </w:rPr>
       </w:pPr>
     </w:p>
@@ -14108,7 +14102,7 @@
           <v:rect id="rectole0000000005" o:spid="_x0000_i1030" style="width:6in;height:218.55pt" o:ole="" o:preferrelative="t" stroked="f">
             <v:imagedata r:id="rId18" o:title=""/>
           </v:rect>
-          <o:OLEObject Type="Embed" ProgID="StaticMetafile" ShapeID="rectole0000000005" DrawAspect="Content" ObjectID="_1840532657" r:id="rId19"/>
+          <o:OLEObject Type="Embed" ProgID="StaticMetafile" ShapeID="rectole0000000005" DrawAspect="Content" ObjectID="_1840559773" r:id="rId19"/>
         </w:object>
       </w:r>
     </w:p>
@@ -14155,23 +14149,23 @@
       <w:pPr>
         <w:rPr>
           <w:rFonts w:ascii="Aptos" w:eastAsia="Aptos" w:hAnsi="Aptos" w:cs="Aptos"/>
-          <w:lang w:val="en-GB"/>
-        </w:rPr>
-      </w:pPr>
-    </w:p>
-    <w:p>
-      <w:pPr>
-        <w:rPr>
-          <w:rFonts w:ascii="Aptos" w:eastAsia="Aptos" w:hAnsi="Aptos" w:cs="Aptos"/>
-          <w:lang w:val="en-GB"/>
-        </w:rPr>
-      </w:pPr>
-    </w:p>
-    <w:p>
-      <w:pPr>
-        <w:rPr>
-          <w:rFonts w:ascii="Aptos" w:eastAsia="Aptos" w:hAnsi="Aptos" w:cs="Aptos"/>
-          <w:lang w:val="en-GB"/>
+          <w:lang w:val="el-GR"/>
+        </w:rPr>
+      </w:pPr>
+    </w:p>
+    <w:p>
+      <w:pPr>
+        <w:rPr>
+          <w:rFonts w:ascii="Aptos" w:eastAsia="Aptos" w:hAnsi="Aptos" w:cs="Aptos"/>
+          <w:lang w:val="el-GR"/>
+        </w:rPr>
+      </w:pPr>
+    </w:p>
+    <w:p>
+      <w:pPr>
+        <w:rPr>
+          <w:rFonts w:ascii="Aptos" w:eastAsia="Aptos" w:hAnsi="Aptos" w:cs="Aptos"/>
+          <w:lang w:val="el-GR"/>
         </w:rPr>
       </w:pPr>
     </w:p>
@@ -14182,7 +14176,7 @@
           <w:rFonts w:ascii="Times New Roman" w:eastAsia="Calibri" w:hAnsi="Times New Roman" w:cs="Times New Roman"/>
           <w:b/>
           <w:bCs/>
-          <w:lang w:val="en-GB"/>
+          <w:lang w:val="el-GR"/>
         </w:rPr>
       </w:pPr>
       <w:bookmarkStart w:id="6" w:name="_Toc229914637"/>
@@ -14253,7 +14247,7 @@
       <w:pPr>
         <w:rPr>
           <w:rFonts w:ascii="Times New Roman" w:hAnsi="Times New Roman" w:cs="Times New Roman"/>
-          <w:lang w:val="en-GB"/>
+          <w:lang w:val="el-GR"/>
         </w:rPr>
       </w:pPr>
     </w:p>
@@ -15905,7 +15899,7 @@
       <w:pPr>
         <w:rPr>
           <w:rFonts w:ascii="Times New Roman" w:eastAsia="Calibri" w:hAnsi="Times New Roman" w:cs="Times New Roman"/>
-          <w:lang w:val="en-GB"/>
+          <w:lang w:val="el-GR"/>
         </w:rPr>
       </w:pPr>
       <w:r>
@@ -15985,7 +15979,7 @@
       <w:pPr>
         <w:rPr>
           <w:rFonts w:ascii="Calibri" w:eastAsia="Calibri" w:hAnsi="Calibri" w:cs="Calibri"/>
-          <w:lang w:val="en-GB"/>
+          <w:lang w:val="el-GR"/>
         </w:rPr>
       </w:pPr>
     </w:p>
@@ -15993,7 +15987,7 @@
       <w:pPr>
         <w:rPr>
           <w:rFonts w:ascii="Calibri" w:eastAsia="Calibri" w:hAnsi="Calibri" w:cs="Calibri"/>
-          <w:lang w:val="en-GB"/>
+          <w:lang w:val="el-GR"/>
         </w:rPr>
       </w:pPr>
     </w:p>
@@ -16008,7 +16002,7 @@
           <v:rect id="rectole0000000006" o:spid="_x0000_i1031" style="width:432.85pt;height:215.55pt" o:ole="" o:preferrelative="t" stroked="f">
             <v:imagedata r:id="rId20" o:title=""/>
           </v:rect>
-          <o:OLEObject Type="Embed" ProgID="StaticMetafile" ShapeID="rectole0000000006" DrawAspect="Content" ObjectID="_1840532658" r:id="rId21"/>
+          <o:OLEObject Type="Embed" ProgID="StaticMetafile" ShapeID="rectole0000000006" DrawAspect="Content" ObjectID="_1840559774" r:id="rId21"/>
         </w:object>
       </w:r>
     </w:p>
@@ -16059,7 +16053,7 @@
           <v:rect id="rectole0000000007" o:spid="_x0000_i1032" style="width:291.45pt;height:549pt" o:ole="" o:preferrelative="t" stroked="f">
             <v:imagedata r:id="rId22" o:title=""/>
           </v:rect>
-          <o:OLEObject Type="Embed" ProgID="StaticMetafile" ShapeID="rectole0000000007" DrawAspect="Content" ObjectID="_1840532659" r:id="rId23"/>
+          <o:OLEObject Type="Embed" ProgID="StaticMetafile" ShapeID="rectole0000000007" DrawAspect="Content" ObjectID="_1840559775" r:id="rId23"/>
         </w:object>
       </w:r>
     </w:p>
@@ -16097,7 +16091,7 @@
           <v:rect id="rectole0000000008" o:spid="_x0000_i1033" style="width:292.7pt;height:547.7pt" o:ole="" o:preferrelative="t" stroked="f">
             <v:imagedata r:id="rId24" o:title=""/>
           </v:rect>
-          <o:OLEObject Type="Embed" ProgID="StaticMetafile" ShapeID="rectole0000000008" DrawAspect="Content" ObjectID="_1840532660" r:id="rId25"/>
+          <o:OLEObject Type="Embed" ProgID="StaticMetafile" ShapeID="rectole0000000008" DrawAspect="Content" ObjectID="_1840559776" r:id="rId25"/>
         </w:object>
       </w:r>
     </w:p>
@@ -16174,7 +16168,7 @@
           <v:rect id="rectole0000000009" o:spid="_x0000_i1034" style="width:294.45pt;height:546pt" o:ole="" o:preferrelative="t" stroked="f">
             <v:imagedata r:id="rId26" o:title=""/>
           </v:rect>
-          <o:OLEObject Type="Embed" ProgID="StaticMetafile" ShapeID="rectole0000000009" DrawAspect="Content" ObjectID="_1840532661" r:id="rId27"/>
+          <o:OLEObject Type="Embed" ProgID="StaticMetafile" ShapeID="rectole0000000009" DrawAspect="Content" ObjectID="_1840559777" r:id="rId27"/>
         </w:object>
       </w:r>
     </w:p>
@@ -16216,7 +16210,7 @@
           <w:rFonts w:ascii="Times New Roman" w:eastAsia="Calibri" w:hAnsi="Times New Roman" w:cs="Times New Roman"/>
           <w:b/>
           <w:bCs/>
-          <w:lang w:val="en-GB"/>
+          <w:lang w:val="el-GR"/>
         </w:rPr>
       </w:pPr>
       <w:bookmarkStart w:id="7" w:name="_Toc229914638"/>
@@ -16236,7 +16230,7 @@
       <w:pPr>
         <w:rPr>
           <w:rFonts w:ascii="Times New Roman" w:hAnsi="Times New Roman" w:cs="Times New Roman"/>
-          <w:lang w:val="en-GB"/>
+          <w:lang w:val="el-GR"/>
         </w:rPr>
       </w:pPr>
     </w:p>
@@ -16679,7 +16673,7 @@
       <w:pPr>
         <w:rPr>
           <w:rFonts w:ascii="Times New Roman" w:eastAsia="Calibri" w:hAnsi="Times New Roman" w:cs="Times New Roman"/>
-          <w:lang w:val="en-GB"/>
+          <w:lang w:val="el-GR"/>
         </w:rPr>
       </w:pPr>
       <w:r>
@@ -16865,7 +16859,7 @@
       <w:pPr>
         <w:rPr>
           <w:rFonts w:ascii="Times New Roman" w:eastAsia="Calibri" w:hAnsi="Times New Roman" w:cs="Times New Roman"/>
-          <w:lang w:val="en-GB"/>
+          <w:lang w:val="el-GR"/>
         </w:rPr>
       </w:pPr>
       <w:r>
@@ -17092,7 +17086,7 @@
       <w:pPr>
         <w:rPr>
           <w:rFonts w:ascii="Times New Roman" w:eastAsia="Calibri" w:hAnsi="Times New Roman" w:cs="Times New Roman"/>
-          <w:lang w:val="en-GB"/>
+          <w:lang w:val="el-GR"/>
         </w:rPr>
       </w:pPr>
       <w:r>
@@ -17239,7 +17233,7 @@
       <w:pPr>
         <w:rPr>
           <w:rFonts w:ascii="Calibri" w:eastAsia="Calibri" w:hAnsi="Calibri" w:cs="Calibri"/>
-          <w:lang w:val="en-GB"/>
+          <w:lang w:val="el-GR"/>
         </w:rPr>
       </w:pPr>
     </w:p>
@@ -17254,7 +17248,7 @@
           <v:rect id="rectole0000000010" o:spid="_x0000_i1035" style="width:432.85pt;height:223.3pt" o:ole="" o:preferrelative="t" stroked="f">
             <v:imagedata r:id="rId28" o:title=""/>
           </v:rect>
-          <o:OLEObject Type="Embed" ProgID="StaticMetafile" ShapeID="rectole0000000010" DrawAspect="Content" ObjectID="_1840532662" r:id="rId29"/>
+          <o:OLEObject Type="Embed" ProgID="StaticMetafile" ShapeID="rectole0000000010" DrawAspect="Content" ObjectID="_1840559778" r:id="rId29"/>
         </w:object>
       </w:r>
     </w:p>
@@ -17325,55 +17319,55 @@
       <w:pPr>
         <w:rPr>
           <w:rFonts w:ascii="Aptos" w:eastAsia="Aptos" w:hAnsi="Aptos" w:cs="Aptos"/>
-          <w:lang w:val="en-GB"/>
-        </w:rPr>
-      </w:pPr>
-    </w:p>
-    <w:p>
-      <w:pPr>
-        <w:rPr>
-          <w:rFonts w:ascii="Aptos" w:eastAsia="Aptos" w:hAnsi="Aptos" w:cs="Aptos"/>
-          <w:lang w:val="en-GB"/>
-        </w:rPr>
-      </w:pPr>
-    </w:p>
-    <w:p>
-      <w:pPr>
-        <w:rPr>
-          <w:rFonts w:ascii="Aptos" w:eastAsia="Aptos" w:hAnsi="Aptos" w:cs="Aptos"/>
-          <w:lang w:val="el-GR"/>
-        </w:rPr>
-      </w:pPr>
-    </w:p>
-    <w:p>
-      <w:pPr>
-        <w:rPr>
-          <w:rFonts w:ascii="Aptos" w:eastAsia="Aptos" w:hAnsi="Aptos" w:cs="Aptos"/>
-          <w:lang w:val="en-GB"/>
-        </w:rPr>
-      </w:pPr>
-    </w:p>
-    <w:p>
-      <w:pPr>
-        <w:rPr>
-          <w:rFonts w:ascii="Aptos" w:eastAsia="Aptos" w:hAnsi="Aptos" w:cs="Aptos"/>
-          <w:lang w:val="en-GB"/>
-        </w:rPr>
-      </w:pPr>
-    </w:p>
-    <w:p>
-      <w:pPr>
-        <w:rPr>
-          <w:rFonts w:ascii="Aptos" w:eastAsia="Aptos" w:hAnsi="Aptos" w:cs="Aptos"/>
-          <w:lang w:val="en-GB"/>
-        </w:rPr>
-      </w:pPr>
-    </w:p>
-    <w:p>
-      <w:pPr>
-        <w:rPr>
-          <w:rFonts w:ascii="Aptos" w:eastAsia="Aptos" w:hAnsi="Aptos" w:cs="Aptos"/>
-          <w:lang w:val="en-GB"/>
+          <w:lang w:val="el-GR"/>
+        </w:rPr>
+      </w:pPr>
+    </w:p>
+    <w:p>
+      <w:pPr>
+        <w:rPr>
+          <w:rFonts w:ascii="Aptos" w:eastAsia="Aptos" w:hAnsi="Aptos" w:cs="Aptos"/>
+          <w:lang w:val="el-GR"/>
+        </w:rPr>
+      </w:pPr>
+    </w:p>
+    <w:p>
+      <w:pPr>
+        <w:rPr>
+          <w:rFonts w:ascii="Aptos" w:eastAsia="Aptos" w:hAnsi="Aptos" w:cs="Aptos"/>
+          <w:lang w:val="el-GR"/>
+        </w:rPr>
+      </w:pPr>
+    </w:p>
+    <w:p>
+      <w:pPr>
+        <w:rPr>
+          <w:rFonts w:ascii="Aptos" w:eastAsia="Aptos" w:hAnsi="Aptos" w:cs="Aptos"/>
+          <w:lang w:val="el-GR"/>
+        </w:rPr>
+      </w:pPr>
+    </w:p>
+    <w:p>
+      <w:pPr>
+        <w:rPr>
+          <w:rFonts w:ascii="Aptos" w:eastAsia="Aptos" w:hAnsi="Aptos" w:cs="Aptos"/>
+          <w:lang w:val="el-GR"/>
+        </w:rPr>
+      </w:pPr>
+    </w:p>
+    <w:p>
+      <w:pPr>
+        <w:rPr>
+          <w:rFonts w:ascii="Aptos" w:eastAsia="Aptos" w:hAnsi="Aptos" w:cs="Aptos"/>
+          <w:lang w:val="el-GR"/>
+        </w:rPr>
+      </w:pPr>
+    </w:p>
+    <w:p>
+      <w:pPr>
+        <w:rPr>
+          <w:rFonts w:ascii="Aptos" w:eastAsia="Aptos" w:hAnsi="Aptos" w:cs="Aptos"/>
+          <w:lang w:val="el-GR"/>
         </w:rPr>
       </w:pPr>
     </w:p>
@@ -17973,15 +17967,15 @@
       <w:pPr>
         <w:rPr>
           <w:rFonts w:ascii="Aptos" w:eastAsia="Aptos" w:hAnsi="Aptos" w:cs="Aptos"/>
-          <w:lang w:val="en-GB"/>
-        </w:rPr>
-      </w:pPr>
-    </w:p>
-    <w:p>
-      <w:pPr>
-        <w:rPr>
-          <w:rFonts w:ascii="Aptos" w:eastAsia="Aptos" w:hAnsi="Aptos" w:cs="Aptos"/>
-          <w:lang w:val="en-GB"/>
+          <w:lang w:val="el-GR"/>
+        </w:rPr>
+      </w:pPr>
+    </w:p>
+    <w:p>
+      <w:pPr>
+        <w:rPr>
+          <w:rFonts w:ascii="Aptos" w:eastAsia="Aptos" w:hAnsi="Aptos" w:cs="Aptos"/>
+          <w:lang w:val="el-GR"/>
         </w:rPr>
       </w:pPr>
     </w:p>
@@ -18000,7 +17994,7 @@
           <w:rFonts w:ascii="Times New Roman" w:eastAsia="Calibri" w:hAnsi="Times New Roman" w:cs="Times New Roman"/>
           <w:b/>
           <w:bCs/>
-          <w:lang w:val="en-GB"/>
+          <w:lang w:val="el-GR"/>
         </w:rPr>
       </w:pPr>
       <w:bookmarkStart w:id="9" w:name="_Toc229914640"/>
@@ -18071,7 +18065,7 @@
       <w:pPr>
         <w:rPr>
           <w:rFonts w:ascii="Times New Roman" w:hAnsi="Times New Roman" w:cs="Times New Roman"/>
-          <w:lang w:val="en-GB"/>
+          <w:lang w:val="el-GR"/>
         </w:rPr>
       </w:pPr>
     </w:p>
@@ -18999,13 +18993,15 @@
       <w:pPr>
         <w:rPr>
           <w:rFonts w:ascii="Aptos" w:eastAsia="Aptos" w:hAnsi="Aptos" w:cs="Aptos"/>
-          <w:shd w:val="clear" w:color="auto" w:fill="000000"/>
-          <w:lang w:val="el-GR"/>
-        </w:rPr>
-      </w:pPr>
-      <w:r>
-        <w:rPr>
-          <w:rFonts w:ascii="Aptos" w:eastAsia="Aptos" w:hAnsi="Aptos" w:cs="Aptos"/>
+          <w:color w:val="FFFFFF" w:themeColor="background1"/>
+          <w:shd w:val="clear" w:color="auto" w:fill="000000"/>
+          <w:lang w:val="el-GR"/>
+        </w:rPr>
+      </w:pPr>
+      <w:r>
+        <w:rPr>
+          <w:rFonts w:ascii="Aptos" w:eastAsia="Aptos" w:hAnsi="Aptos" w:cs="Aptos"/>
+          <w:color w:val="FFFFFF" w:themeColor="background1"/>
           <w:shd w:val="clear" w:color="auto" w:fill="000000"/>
           <w:lang w:val="el-GR"/>
         </w:rPr>
@@ -19016,13 +19012,15 @@
       <w:pPr>
         <w:rPr>
           <w:rFonts w:ascii="Aptos" w:eastAsia="Aptos" w:hAnsi="Aptos" w:cs="Aptos"/>
-          <w:shd w:val="clear" w:color="auto" w:fill="000000"/>
-          <w:lang w:val="el-GR"/>
-        </w:rPr>
-      </w:pPr>
-      <w:r>
-        <w:rPr>
-          <w:rFonts w:ascii="Aptos" w:eastAsia="Aptos" w:hAnsi="Aptos" w:cs="Aptos"/>
+          <w:color w:val="FFFFFF" w:themeColor="background1"/>
+          <w:shd w:val="clear" w:color="auto" w:fill="000000"/>
+          <w:lang w:val="el-GR"/>
+        </w:rPr>
+      </w:pPr>
+      <w:r>
+        <w:rPr>
+          <w:rFonts w:ascii="Aptos" w:eastAsia="Aptos" w:hAnsi="Aptos" w:cs="Aptos"/>
+          <w:color w:val="FFFFFF" w:themeColor="background1"/>
           <w:shd w:val="clear" w:color="auto" w:fill="000000"/>
           <w:lang w:val="el-GR"/>
         </w:rPr>
@@ -19033,13 +19031,15 @@
       <w:pPr>
         <w:rPr>
           <w:rFonts w:ascii="Aptos" w:eastAsia="Aptos" w:hAnsi="Aptos" w:cs="Aptos"/>
-          <w:shd w:val="clear" w:color="auto" w:fill="000000"/>
-          <w:lang w:val="el-GR"/>
-        </w:rPr>
-      </w:pPr>
-      <w:r>
-        <w:rPr>
-          <w:rFonts w:ascii="Aptos" w:eastAsia="Aptos" w:hAnsi="Aptos" w:cs="Aptos"/>
+          <w:color w:val="FFFFFF" w:themeColor="background1"/>
+          <w:shd w:val="clear" w:color="auto" w:fill="000000"/>
+          <w:lang w:val="el-GR"/>
+        </w:rPr>
+      </w:pPr>
+      <w:r>
+        <w:rPr>
+          <w:rFonts w:ascii="Aptos" w:eastAsia="Aptos" w:hAnsi="Aptos" w:cs="Aptos"/>
+          <w:color w:val="FFFFFF" w:themeColor="background1"/>
           <w:shd w:val="clear" w:color="auto" w:fill="000000"/>
           <w:lang w:val="el-GR"/>
         </w:rPr>
@@ -19048,6 +19048,7 @@
       <w:r>
         <w:rPr>
           <w:rFonts w:ascii="Aptos" w:eastAsia="Aptos" w:hAnsi="Aptos" w:cs="Aptos"/>
+          <w:color w:val="FFFFFF" w:themeColor="background1"/>
           <w:shd w:val="clear" w:color="auto" w:fill="000000"/>
         </w:rPr>
         <w:t>id</w:t>
@@ -19055,6 +19056,7 @@
       <w:r>
         <w:rPr>
           <w:rFonts w:ascii="Aptos" w:eastAsia="Aptos" w:hAnsi="Aptos" w:cs="Aptos"/>
+          <w:color w:val="FFFFFF" w:themeColor="background1"/>
           <w:shd w:val="clear" w:color="auto" w:fill="000000"/>
           <w:lang w:val="el-GR"/>
         </w:rPr>
@@ -19065,13 +19067,15 @@
       <w:pPr>
         <w:rPr>
           <w:rFonts w:ascii="Aptos" w:eastAsia="Aptos" w:hAnsi="Aptos" w:cs="Aptos"/>
-          <w:shd w:val="clear" w:color="auto" w:fill="000000"/>
-          <w:lang w:val="el-GR"/>
-        </w:rPr>
-      </w:pPr>
-      <w:r>
-        <w:rPr>
-          <w:rFonts w:ascii="Aptos" w:eastAsia="Aptos" w:hAnsi="Aptos" w:cs="Aptos"/>
+          <w:color w:val="FFFFFF" w:themeColor="background1"/>
+          <w:shd w:val="clear" w:color="auto" w:fill="000000"/>
+          <w:lang w:val="el-GR"/>
+        </w:rPr>
+      </w:pPr>
+      <w:r>
+        <w:rPr>
+          <w:rFonts w:ascii="Aptos" w:eastAsia="Aptos" w:hAnsi="Aptos" w:cs="Aptos"/>
+          <w:color w:val="FFFFFF" w:themeColor="background1"/>
           <w:shd w:val="clear" w:color="auto" w:fill="000000"/>
           <w:lang w:val="el-GR"/>
         </w:rPr>
@@ -19080,6 +19084,7 @@
       <w:r>
         <w:rPr>
           <w:rFonts w:ascii="Aptos" w:eastAsia="Aptos" w:hAnsi="Aptos" w:cs="Aptos"/>
+          <w:color w:val="FFFFFF" w:themeColor="background1"/>
           <w:shd w:val="clear" w:color="auto" w:fill="000000"/>
         </w:rPr>
         <w:t>name</w:t>
@@ -19087,6 +19092,7 @@
       <w:r>
         <w:rPr>
           <w:rFonts w:ascii="Aptos" w:eastAsia="Aptos" w:hAnsi="Aptos" w:cs="Aptos"/>
+          <w:color w:val="FFFFFF" w:themeColor="background1"/>
           <w:shd w:val="clear" w:color="auto" w:fill="000000"/>
           <w:lang w:val="el-GR"/>
         </w:rPr>
@@ -19097,12 +19103,14 @@
       <w:pPr>
         <w:rPr>
           <w:rFonts w:ascii="Aptos" w:eastAsia="Aptos" w:hAnsi="Aptos" w:cs="Aptos"/>
-          <w:shd w:val="clear" w:color="auto" w:fill="000000"/>
-        </w:rPr>
-      </w:pPr>
-      <w:r>
-        <w:rPr>
-          <w:rFonts w:ascii="Aptos" w:eastAsia="Aptos" w:hAnsi="Aptos" w:cs="Aptos"/>
+          <w:color w:val="FFFFFF" w:themeColor="background1"/>
+          <w:shd w:val="clear" w:color="auto" w:fill="000000"/>
+        </w:rPr>
+      </w:pPr>
+      <w:r>
+        <w:rPr>
+          <w:rFonts w:ascii="Aptos" w:eastAsia="Aptos" w:hAnsi="Aptos" w:cs="Aptos"/>
+          <w:color w:val="FFFFFF" w:themeColor="background1"/>
           <w:shd w:val="clear" w:color="auto" w:fill="000000"/>
           <w:lang w:val="el-GR"/>
         </w:rPr>
@@ -19111,6 +19119,7 @@
       <w:r>
         <w:rPr>
           <w:rFonts w:ascii="Aptos" w:eastAsia="Aptos" w:hAnsi="Aptos" w:cs="Aptos"/>
+          <w:color w:val="FFFFFF" w:themeColor="background1"/>
           <w:shd w:val="clear" w:color="auto" w:fill="000000"/>
         </w:rPr>
         <w:t>"open": false,</w:t>
@@ -19120,12 +19129,14 @@
       <w:pPr>
         <w:rPr>
           <w:rFonts w:ascii="Aptos" w:eastAsia="Aptos" w:hAnsi="Aptos" w:cs="Aptos"/>
-          <w:shd w:val="clear" w:color="auto" w:fill="000000"/>
-        </w:rPr>
-      </w:pPr>
-      <w:r>
-        <w:rPr>
-          <w:rFonts w:ascii="Aptos" w:eastAsia="Aptos" w:hAnsi="Aptos" w:cs="Aptos"/>
+          <w:color w:val="FFFFFF" w:themeColor="background1"/>
+          <w:shd w:val="clear" w:color="auto" w:fill="000000"/>
+        </w:rPr>
+      </w:pPr>
+      <w:r>
+        <w:rPr>
+          <w:rFonts w:ascii="Aptos" w:eastAsia="Aptos" w:hAnsi="Aptos" w:cs="Aptos"/>
+          <w:color w:val="FFFFFF" w:themeColor="background1"/>
           <w:shd w:val="clear" w:color="auto" w:fill="000000"/>
         </w:rPr>
         <w:t xml:space="preserve">    "total": 0.0,</w:t>
@@ -19135,12 +19146,14 @@
       <w:pPr>
         <w:rPr>
           <w:rFonts w:ascii="Aptos" w:eastAsia="Aptos" w:hAnsi="Aptos" w:cs="Aptos"/>
-          <w:shd w:val="clear" w:color="auto" w:fill="000000"/>
-        </w:rPr>
-      </w:pPr>
-      <w:r>
-        <w:rPr>
-          <w:rFonts w:ascii="Aptos" w:eastAsia="Aptos" w:hAnsi="Aptos" w:cs="Aptos"/>
+          <w:color w:val="FFFFFF" w:themeColor="background1"/>
+          <w:shd w:val="clear" w:color="auto" w:fill="000000"/>
+        </w:rPr>
+      </w:pPr>
+      <w:r>
+        <w:rPr>
+          <w:rFonts w:ascii="Aptos" w:eastAsia="Aptos" w:hAnsi="Aptos" w:cs="Aptos"/>
+          <w:color w:val="FFFFFF" w:themeColor="background1"/>
           <w:shd w:val="clear" w:color="auto" w:fill="000000"/>
         </w:rPr>
         <w:t xml:space="preserve">    "items": []</w:t>
@@ -19150,12 +19163,14 @@
       <w:pPr>
         <w:rPr>
           <w:rFonts w:ascii="Aptos" w:eastAsia="Aptos" w:hAnsi="Aptos" w:cs="Aptos"/>
-          <w:shd w:val="clear" w:color="auto" w:fill="000000"/>
-        </w:rPr>
-      </w:pPr>
-      <w:r>
-        <w:rPr>
-          <w:rFonts w:ascii="Aptos" w:eastAsia="Aptos" w:hAnsi="Aptos" w:cs="Aptos"/>
+          <w:color w:val="FFFFFF" w:themeColor="background1"/>
+          <w:shd w:val="clear" w:color="auto" w:fill="000000"/>
+        </w:rPr>
+      </w:pPr>
+      <w:r>
+        <w:rPr>
+          <w:rFonts w:ascii="Aptos" w:eastAsia="Aptos" w:hAnsi="Aptos" w:cs="Aptos"/>
+          <w:color w:val="FFFFFF" w:themeColor="background1"/>
           <w:shd w:val="clear" w:color="auto" w:fill="000000"/>
         </w:rPr>
         <w:t xml:space="preserve">  },</w:t>
@@ -19165,12 +19180,14 @@
       <w:pPr>
         <w:rPr>
           <w:rFonts w:ascii="Aptos" w:eastAsia="Aptos" w:hAnsi="Aptos" w:cs="Aptos"/>
-          <w:shd w:val="clear" w:color="auto" w:fill="000000"/>
-        </w:rPr>
-      </w:pPr>
-      <w:r>
-        <w:rPr>
-          <w:rFonts w:ascii="Aptos" w:eastAsia="Aptos" w:hAnsi="Aptos" w:cs="Aptos"/>
+          <w:color w:val="FFFFFF" w:themeColor="background1"/>
+          <w:shd w:val="clear" w:color="auto" w:fill="000000"/>
+        </w:rPr>
+      </w:pPr>
+      <w:r>
+        <w:rPr>
+          <w:rFonts w:ascii="Aptos" w:eastAsia="Aptos" w:hAnsi="Aptos" w:cs="Aptos"/>
+          <w:color w:val="FFFFFF" w:themeColor="background1"/>
           <w:shd w:val="clear" w:color="auto" w:fill="000000"/>
         </w:rPr>
         <w:lastRenderedPageBreak/>
@@ -19181,12 +19198,14 @@
       <w:pPr>
         <w:rPr>
           <w:rFonts w:ascii="Aptos" w:eastAsia="Aptos" w:hAnsi="Aptos" w:cs="Aptos"/>
-          <w:shd w:val="clear" w:color="auto" w:fill="000000"/>
-        </w:rPr>
-      </w:pPr>
-      <w:r>
-        <w:rPr>
-          <w:rFonts w:ascii="Aptos" w:eastAsia="Aptos" w:hAnsi="Aptos" w:cs="Aptos"/>
+          <w:color w:val="FFFFFF" w:themeColor="background1"/>
+          <w:shd w:val="clear" w:color="auto" w:fill="000000"/>
+        </w:rPr>
+      </w:pPr>
+      <w:r>
+        <w:rPr>
+          <w:rFonts w:ascii="Aptos" w:eastAsia="Aptos" w:hAnsi="Aptos" w:cs="Aptos"/>
+          <w:color w:val="FFFFFF" w:themeColor="background1"/>
           <w:shd w:val="clear" w:color="auto" w:fill="000000"/>
         </w:rPr>
         <w:t xml:space="preserve">    "id": 15,</w:t>
@@ -19196,12 +19215,14 @@
       <w:pPr>
         <w:rPr>
           <w:rFonts w:ascii="Aptos" w:eastAsia="Aptos" w:hAnsi="Aptos" w:cs="Aptos"/>
-          <w:shd w:val="clear" w:color="auto" w:fill="000000"/>
-        </w:rPr>
-      </w:pPr>
-      <w:r>
-        <w:rPr>
-          <w:rFonts w:ascii="Aptos" w:eastAsia="Aptos" w:hAnsi="Aptos" w:cs="Aptos"/>
+          <w:color w:val="FFFFFF" w:themeColor="background1"/>
+          <w:shd w:val="clear" w:color="auto" w:fill="000000"/>
+        </w:rPr>
+      </w:pPr>
+      <w:r>
+        <w:rPr>
+          <w:rFonts w:ascii="Aptos" w:eastAsia="Aptos" w:hAnsi="Aptos" w:cs="Aptos"/>
+          <w:color w:val="FFFFFF" w:themeColor="background1"/>
           <w:shd w:val="clear" w:color="auto" w:fill="000000"/>
         </w:rPr>
         <w:t xml:space="preserve">    "name": "Giorgos",</w:t>
@@ -19211,12 +19232,14 @@
       <w:pPr>
         <w:rPr>
           <w:rFonts w:ascii="Aptos" w:eastAsia="Aptos" w:hAnsi="Aptos" w:cs="Aptos"/>
-          <w:shd w:val="clear" w:color="auto" w:fill="000000"/>
-        </w:rPr>
-      </w:pPr>
-      <w:r>
-        <w:rPr>
-          <w:rFonts w:ascii="Aptos" w:eastAsia="Aptos" w:hAnsi="Aptos" w:cs="Aptos"/>
+          <w:color w:val="FFFFFF" w:themeColor="background1"/>
+          <w:shd w:val="clear" w:color="auto" w:fill="000000"/>
+        </w:rPr>
+      </w:pPr>
+      <w:r>
+        <w:rPr>
+          <w:rFonts w:ascii="Aptos" w:eastAsia="Aptos" w:hAnsi="Aptos" w:cs="Aptos"/>
+          <w:color w:val="FFFFFF" w:themeColor="background1"/>
           <w:shd w:val="clear" w:color="auto" w:fill="000000"/>
         </w:rPr>
         <w:t xml:space="preserve">    "open": true,</w:t>
@@ -19226,12 +19249,14 @@
       <w:pPr>
         <w:rPr>
           <w:rFonts w:ascii="Aptos" w:eastAsia="Aptos" w:hAnsi="Aptos" w:cs="Aptos"/>
-          <w:shd w:val="clear" w:color="auto" w:fill="000000"/>
-        </w:rPr>
-      </w:pPr>
-      <w:r>
-        <w:rPr>
-          <w:rFonts w:ascii="Aptos" w:eastAsia="Aptos" w:hAnsi="Aptos" w:cs="Aptos"/>
+          <w:color w:val="FFFFFF" w:themeColor="background1"/>
+          <w:shd w:val="clear" w:color="auto" w:fill="000000"/>
+        </w:rPr>
+      </w:pPr>
+      <w:r>
+        <w:rPr>
+          <w:rFonts w:ascii="Aptos" w:eastAsia="Aptos" w:hAnsi="Aptos" w:cs="Aptos"/>
+          <w:color w:val="FFFFFF" w:themeColor="background1"/>
           <w:shd w:val="clear" w:color="auto" w:fill="000000"/>
         </w:rPr>
         <w:t xml:space="preserve">    "total": 9.0,</w:t>
@@ -19241,12 +19266,14 @@
       <w:pPr>
         <w:rPr>
           <w:rFonts w:ascii="Aptos" w:eastAsia="Aptos" w:hAnsi="Aptos" w:cs="Aptos"/>
-          <w:shd w:val="clear" w:color="auto" w:fill="000000"/>
-        </w:rPr>
-      </w:pPr>
-      <w:r>
-        <w:rPr>
-          <w:rFonts w:ascii="Aptos" w:eastAsia="Aptos" w:hAnsi="Aptos" w:cs="Aptos"/>
+          <w:color w:val="FFFFFF" w:themeColor="background1"/>
+          <w:shd w:val="clear" w:color="auto" w:fill="000000"/>
+        </w:rPr>
+      </w:pPr>
+      <w:r>
+        <w:rPr>
+          <w:rFonts w:ascii="Aptos" w:eastAsia="Aptos" w:hAnsi="Aptos" w:cs="Aptos"/>
+          <w:color w:val="FFFFFF" w:themeColor="background1"/>
           <w:shd w:val="clear" w:color="auto" w:fill="000000"/>
         </w:rPr>
         <w:t xml:space="preserve">    "items": [</w:t>
@@ -19256,12 +19283,14 @@
       <w:pPr>
         <w:rPr>
           <w:rFonts w:ascii="Aptos" w:eastAsia="Aptos" w:hAnsi="Aptos" w:cs="Aptos"/>
-          <w:shd w:val="clear" w:color="auto" w:fill="000000"/>
-        </w:rPr>
-      </w:pPr>
-      <w:r>
-        <w:rPr>
-          <w:rFonts w:ascii="Aptos" w:eastAsia="Aptos" w:hAnsi="Aptos" w:cs="Aptos"/>
+          <w:color w:val="FFFFFF" w:themeColor="background1"/>
+          <w:shd w:val="clear" w:color="auto" w:fill="000000"/>
+        </w:rPr>
+      </w:pPr>
+      <w:r>
+        <w:rPr>
+          <w:rFonts w:ascii="Aptos" w:eastAsia="Aptos" w:hAnsi="Aptos" w:cs="Aptos"/>
+          <w:color w:val="FFFFFF" w:themeColor="background1"/>
           <w:shd w:val="clear" w:color="auto" w:fill="000000"/>
         </w:rPr>
         <w:t xml:space="preserve">      </w:t>
@@ -19270,6 +19299,7 @@
       <w:r>
         <w:rPr>
           <w:rFonts w:ascii="Aptos" w:eastAsia="Aptos" w:hAnsi="Aptos" w:cs="Aptos"/>
+          <w:color w:val="FFFFFF" w:themeColor="background1"/>
           <w:shd w:val="clear" w:color="auto" w:fill="000000"/>
         </w:rPr>
         <w:t>{ "</w:t>
@@ -19278,6 +19308,7 @@
       <w:r>
         <w:rPr>
           <w:rFonts w:ascii="Aptos" w:eastAsia="Aptos" w:hAnsi="Aptos" w:cs="Aptos"/>
+          <w:color w:val="FFFFFF" w:themeColor="background1"/>
           <w:shd w:val="clear" w:color="auto" w:fill="000000"/>
         </w:rPr>
         <w:t xml:space="preserve">name": "Draft Beer 500ml", "category": "Beer", "price": </w:t>
@@ -19286,6 +19317,7 @@
       <w:r>
         <w:rPr>
           <w:rFonts w:ascii="Aptos" w:eastAsia="Aptos" w:hAnsi="Aptos" w:cs="Aptos"/>
+          <w:color w:val="FFFFFF" w:themeColor="background1"/>
           <w:shd w:val="clear" w:color="auto" w:fill="000000"/>
         </w:rPr>
         <w:t>4.5 }</w:t>
@@ -19294,6 +19326,7 @@
       <w:r>
         <w:rPr>
           <w:rFonts w:ascii="Aptos" w:eastAsia="Aptos" w:hAnsi="Aptos" w:cs="Aptos"/>
+          <w:color w:val="FFFFFF" w:themeColor="background1"/>
           <w:shd w:val="clear" w:color="auto" w:fill="000000"/>
         </w:rPr>
         <w:t>,</w:t>
@@ -19303,12 +19336,14 @@
       <w:pPr>
         <w:rPr>
           <w:rFonts w:ascii="Aptos" w:eastAsia="Aptos" w:hAnsi="Aptos" w:cs="Aptos"/>
-          <w:shd w:val="clear" w:color="auto" w:fill="000000"/>
-        </w:rPr>
-      </w:pPr>
-      <w:r>
-        <w:rPr>
-          <w:rFonts w:ascii="Aptos" w:eastAsia="Aptos" w:hAnsi="Aptos" w:cs="Aptos"/>
+          <w:color w:val="FFFFFF" w:themeColor="background1"/>
+          <w:shd w:val="clear" w:color="auto" w:fill="000000"/>
+        </w:rPr>
+      </w:pPr>
+      <w:r>
+        <w:rPr>
+          <w:rFonts w:ascii="Aptos" w:eastAsia="Aptos" w:hAnsi="Aptos" w:cs="Aptos"/>
+          <w:color w:val="FFFFFF" w:themeColor="background1"/>
           <w:shd w:val="clear" w:color="auto" w:fill="000000"/>
         </w:rPr>
         <w:t xml:space="preserve">      </w:t>
@@ -19317,6 +19352,7 @@
       <w:r>
         <w:rPr>
           <w:rFonts w:ascii="Aptos" w:eastAsia="Aptos" w:hAnsi="Aptos" w:cs="Aptos"/>
+          <w:color w:val="FFFFFF" w:themeColor="background1"/>
           <w:shd w:val="clear" w:color="auto" w:fill="000000"/>
         </w:rPr>
         <w:t>{ "</w:t>
@@ -19325,6 +19361,7 @@
       <w:r>
         <w:rPr>
           <w:rFonts w:ascii="Aptos" w:eastAsia="Aptos" w:hAnsi="Aptos" w:cs="Aptos"/>
+          <w:color w:val="FFFFFF" w:themeColor="background1"/>
           <w:shd w:val="clear" w:color="auto" w:fill="000000"/>
         </w:rPr>
         <w:t xml:space="preserve">name": "Draft Beer 500ml", "category": "Beer", "price": </w:t>
@@ -19333,6 +19370,7 @@
       <w:r>
         <w:rPr>
           <w:rFonts w:ascii="Aptos" w:eastAsia="Aptos" w:hAnsi="Aptos" w:cs="Aptos"/>
+          <w:color w:val="FFFFFF" w:themeColor="background1"/>
           <w:shd w:val="clear" w:color="auto" w:fill="000000"/>
         </w:rPr>
         <w:t>4.5 }</w:t>
@@ -19343,13 +19381,15 @@
       <w:pPr>
         <w:rPr>
           <w:rFonts w:ascii="Aptos" w:eastAsia="Aptos" w:hAnsi="Aptos" w:cs="Aptos"/>
-          <w:shd w:val="clear" w:color="auto" w:fill="000000"/>
-          <w:lang w:val="el-GR"/>
-        </w:rPr>
-      </w:pPr>
-      <w:r>
-        <w:rPr>
-          <w:rFonts w:ascii="Aptos" w:eastAsia="Aptos" w:hAnsi="Aptos" w:cs="Aptos"/>
+          <w:color w:val="FFFFFF" w:themeColor="background1"/>
+          <w:shd w:val="clear" w:color="auto" w:fill="000000"/>
+          <w:lang w:val="el-GR"/>
+        </w:rPr>
+      </w:pPr>
+      <w:r>
+        <w:rPr>
+          <w:rFonts w:ascii="Aptos" w:eastAsia="Aptos" w:hAnsi="Aptos" w:cs="Aptos"/>
+          <w:color w:val="FFFFFF" w:themeColor="background1"/>
           <w:shd w:val="clear" w:color="auto" w:fill="000000"/>
         </w:rPr>
         <w:t xml:space="preserve">    </w:t>
@@ -19357,6 +19397,7 @@
       <w:r>
         <w:rPr>
           <w:rFonts w:ascii="Aptos" w:eastAsia="Aptos" w:hAnsi="Aptos" w:cs="Aptos"/>
+          <w:color w:val="FFFFFF" w:themeColor="background1"/>
           <w:shd w:val="clear" w:color="auto" w:fill="000000"/>
           <w:lang w:val="el-GR"/>
         </w:rPr>
@@ -19367,13 +19408,15 @@
       <w:pPr>
         <w:rPr>
           <w:rFonts w:ascii="Aptos" w:eastAsia="Aptos" w:hAnsi="Aptos" w:cs="Aptos"/>
-          <w:shd w:val="clear" w:color="auto" w:fill="000000"/>
-          <w:lang w:val="el-GR"/>
-        </w:rPr>
-      </w:pPr>
-      <w:r>
-        <w:rPr>
-          <w:rFonts w:ascii="Aptos" w:eastAsia="Aptos" w:hAnsi="Aptos" w:cs="Aptos"/>
+          <w:color w:val="FFFFFF" w:themeColor="background1"/>
+          <w:shd w:val="clear" w:color="auto" w:fill="000000"/>
+          <w:lang w:val="el-GR"/>
+        </w:rPr>
+      </w:pPr>
+      <w:r>
+        <w:rPr>
+          <w:rFonts w:ascii="Aptos" w:eastAsia="Aptos" w:hAnsi="Aptos" w:cs="Aptos"/>
+          <w:color w:val="FFFFFF" w:themeColor="background1"/>
           <w:shd w:val="clear" w:color="auto" w:fill="000000"/>
           <w:lang w:val="el-GR"/>
         </w:rPr>
@@ -19384,13 +19427,15 @@
       <w:pPr>
         <w:rPr>
           <w:rFonts w:ascii="Aptos" w:eastAsia="Aptos" w:hAnsi="Aptos" w:cs="Aptos"/>
-          <w:shd w:val="clear" w:color="auto" w:fill="000000"/>
-          <w:lang w:val="el-GR"/>
-        </w:rPr>
-      </w:pPr>
-      <w:r>
-        <w:rPr>
-          <w:rFonts w:ascii="Aptos" w:eastAsia="Aptos" w:hAnsi="Aptos" w:cs="Aptos"/>
+          <w:color w:val="FFFFFF" w:themeColor="background1"/>
+          <w:shd w:val="clear" w:color="auto" w:fill="000000"/>
+          <w:lang w:val="el-GR"/>
+        </w:rPr>
+      </w:pPr>
+      <w:r>
+        <w:rPr>
+          <w:rFonts w:ascii="Aptos" w:eastAsia="Aptos" w:hAnsi="Aptos" w:cs="Aptos"/>
+          <w:color w:val="FFFFFF" w:themeColor="background1"/>
           <w:shd w:val="clear" w:color="auto" w:fill="000000"/>
           <w:lang w:val="el-GR"/>
         </w:rPr>
@@ -19634,13 +19679,15 @@
       <w:pPr>
         <w:rPr>
           <w:rFonts w:ascii="Aptos" w:eastAsia="Aptos" w:hAnsi="Aptos" w:cs="Aptos"/>
-          <w:shd w:val="clear" w:color="auto" w:fill="000000"/>
-          <w:lang w:val="el-GR"/>
-        </w:rPr>
-      </w:pPr>
-      <w:r>
-        <w:rPr>
-          <w:rFonts w:ascii="Aptos" w:eastAsia="Aptos" w:hAnsi="Aptos" w:cs="Aptos"/>
+          <w:color w:val="FFFFFF" w:themeColor="background1"/>
+          <w:shd w:val="clear" w:color="auto" w:fill="000000"/>
+          <w:lang w:val="el-GR"/>
+        </w:rPr>
+      </w:pPr>
+      <w:r>
+        <w:rPr>
+          <w:rFonts w:ascii="Aptos" w:eastAsia="Aptos" w:hAnsi="Aptos" w:cs="Aptos"/>
+          <w:color w:val="FFFFFF" w:themeColor="background1"/>
           <w:shd w:val="clear" w:color="auto" w:fill="000000"/>
           <w:lang w:val="el-GR"/>
         </w:rPr>
@@ -19651,13 +19698,15 @@
       <w:pPr>
         <w:rPr>
           <w:rFonts w:ascii="Aptos" w:eastAsia="Aptos" w:hAnsi="Aptos" w:cs="Aptos"/>
-          <w:shd w:val="clear" w:color="auto" w:fill="000000"/>
-          <w:lang w:val="el-GR"/>
-        </w:rPr>
-      </w:pPr>
-      <w:r>
-        <w:rPr>
-          <w:rFonts w:ascii="Aptos" w:eastAsia="Aptos" w:hAnsi="Aptos" w:cs="Aptos"/>
+          <w:color w:val="FFFFFF" w:themeColor="background1"/>
+          <w:shd w:val="clear" w:color="auto" w:fill="000000"/>
+          <w:lang w:val="el-GR"/>
+        </w:rPr>
+      </w:pPr>
+      <w:r>
+        <w:rPr>
+          <w:rFonts w:ascii="Aptos" w:eastAsia="Aptos" w:hAnsi="Aptos" w:cs="Aptos"/>
+          <w:color w:val="FFFFFF" w:themeColor="background1"/>
           <w:shd w:val="clear" w:color="auto" w:fill="000000"/>
           <w:lang w:val="el-GR"/>
         </w:rPr>
@@ -19666,6 +19715,7 @@
       <w:r>
         <w:rPr>
           <w:rFonts w:ascii="Aptos" w:eastAsia="Aptos" w:hAnsi="Aptos" w:cs="Aptos"/>
+          <w:color w:val="FFFFFF" w:themeColor="background1"/>
           <w:shd w:val="clear" w:color="auto" w:fill="000000"/>
         </w:rPr>
         <w:t>id</w:t>
@@ -19673,6 +19723,7 @@
       <w:r>
         <w:rPr>
           <w:rFonts w:ascii="Aptos" w:eastAsia="Aptos" w:hAnsi="Aptos" w:cs="Aptos"/>
+          <w:color w:val="FFFFFF" w:themeColor="background1"/>
           <w:shd w:val="clear" w:color="auto" w:fill="000000"/>
           <w:lang w:val="el-GR"/>
         </w:rPr>
@@ -19683,13 +19734,15 @@
       <w:pPr>
         <w:rPr>
           <w:rFonts w:ascii="Aptos" w:eastAsia="Aptos" w:hAnsi="Aptos" w:cs="Aptos"/>
-          <w:shd w:val="clear" w:color="auto" w:fill="000000"/>
-          <w:lang w:val="el-GR"/>
-        </w:rPr>
-      </w:pPr>
-      <w:r>
-        <w:rPr>
-          <w:rFonts w:ascii="Aptos" w:eastAsia="Aptos" w:hAnsi="Aptos" w:cs="Aptos"/>
+          <w:color w:val="FFFFFF" w:themeColor="background1"/>
+          <w:shd w:val="clear" w:color="auto" w:fill="000000"/>
+          <w:lang w:val="el-GR"/>
+        </w:rPr>
+      </w:pPr>
+      <w:r>
+        <w:rPr>
+          <w:rFonts w:ascii="Aptos" w:eastAsia="Aptos" w:hAnsi="Aptos" w:cs="Aptos"/>
+          <w:color w:val="FFFFFF" w:themeColor="background1"/>
           <w:shd w:val="clear" w:color="auto" w:fill="000000"/>
           <w:lang w:val="el-GR"/>
         </w:rPr>
@@ -19698,6 +19751,7 @@
       <w:r>
         <w:rPr>
           <w:rFonts w:ascii="Aptos" w:eastAsia="Aptos" w:hAnsi="Aptos" w:cs="Aptos"/>
+          <w:color w:val="FFFFFF" w:themeColor="background1"/>
           <w:shd w:val="clear" w:color="auto" w:fill="000000"/>
         </w:rPr>
         <w:t>name</w:t>
@@ -19705,6 +19759,7 @@
       <w:r>
         <w:rPr>
           <w:rFonts w:ascii="Aptos" w:eastAsia="Aptos" w:hAnsi="Aptos" w:cs="Aptos"/>
+          <w:color w:val="FFFFFF" w:themeColor="background1"/>
           <w:shd w:val="clear" w:color="auto" w:fill="000000"/>
           <w:lang w:val="el-GR"/>
         </w:rPr>
@@ -19713,6 +19768,7 @@
       <w:r>
         <w:rPr>
           <w:rFonts w:ascii="Aptos" w:eastAsia="Aptos" w:hAnsi="Aptos" w:cs="Aptos"/>
+          <w:color w:val="FFFFFF" w:themeColor="background1"/>
           <w:shd w:val="clear" w:color="auto" w:fill="000000"/>
         </w:rPr>
         <w:t>Nikos</w:t>
@@ -19720,6 +19776,7 @@
       <w:r>
         <w:rPr>
           <w:rFonts w:ascii="Aptos" w:eastAsia="Aptos" w:hAnsi="Aptos" w:cs="Aptos"/>
+          <w:color w:val="FFFFFF" w:themeColor="background1"/>
           <w:shd w:val="clear" w:color="auto" w:fill="000000"/>
           <w:lang w:val="el-GR"/>
         </w:rPr>
@@ -19730,12 +19787,14 @@
       <w:pPr>
         <w:rPr>
           <w:rFonts w:ascii="Aptos" w:eastAsia="Aptos" w:hAnsi="Aptos" w:cs="Aptos"/>
-          <w:shd w:val="clear" w:color="auto" w:fill="000000"/>
-        </w:rPr>
-      </w:pPr>
-      <w:r>
-        <w:rPr>
-          <w:rFonts w:ascii="Aptos" w:eastAsia="Aptos" w:hAnsi="Aptos" w:cs="Aptos"/>
+          <w:color w:val="FFFFFF" w:themeColor="background1"/>
+          <w:shd w:val="clear" w:color="auto" w:fill="000000"/>
+        </w:rPr>
+      </w:pPr>
+      <w:r>
+        <w:rPr>
+          <w:rFonts w:ascii="Aptos" w:eastAsia="Aptos" w:hAnsi="Aptos" w:cs="Aptos"/>
+          <w:color w:val="FFFFFF" w:themeColor="background1"/>
           <w:shd w:val="clear" w:color="auto" w:fill="000000"/>
           <w:lang w:val="el-GR"/>
         </w:rPr>
@@ -19744,6 +19803,7 @@
       <w:r>
         <w:rPr>
           <w:rFonts w:ascii="Aptos" w:eastAsia="Aptos" w:hAnsi="Aptos" w:cs="Aptos"/>
+          <w:color w:val="FFFFFF" w:themeColor="background1"/>
           <w:shd w:val="clear" w:color="auto" w:fill="000000"/>
         </w:rPr>
         <w:t>"open": true,</w:t>
@@ -19753,12 +19813,14 @@
       <w:pPr>
         <w:rPr>
           <w:rFonts w:ascii="Aptos" w:eastAsia="Aptos" w:hAnsi="Aptos" w:cs="Aptos"/>
-          <w:shd w:val="clear" w:color="auto" w:fill="000000"/>
-        </w:rPr>
-      </w:pPr>
-      <w:r>
-        <w:rPr>
-          <w:rFonts w:ascii="Aptos" w:eastAsia="Aptos" w:hAnsi="Aptos" w:cs="Aptos"/>
+          <w:color w:val="FFFFFF" w:themeColor="background1"/>
+          <w:shd w:val="clear" w:color="auto" w:fill="000000"/>
+        </w:rPr>
+      </w:pPr>
+      <w:r>
+        <w:rPr>
+          <w:rFonts w:ascii="Aptos" w:eastAsia="Aptos" w:hAnsi="Aptos" w:cs="Aptos"/>
+          <w:color w:val="FFFFFF" w:themeColor="background1"/>
           <w:shd w:val="clear" w:color="auto" w:fill="000000"/>
         </w:rPr>
         <w:t xml:space="preserve">  "total": 12.5,</w:t>
@@ -19768,12 +19830,14 @@
       <w:pPr>
         <w:rPr>
           <w:rFonts w:ascii="Aptos" w:eastAsia="Aptos" w:hAnsi="Aptos" w:cs="Aptos"/>
-          <w:shd w:val="clear" w:color="auto" w:fill="000000"/>
-        </w:rPr>
-      </w:pPr>
-      <w:r>
-        <w:rPr>
-          <w:rFonts w:ascii="Aptos" w:eastAsia="Aptos" w:hAnsi="Aptos" w:cs="Aptos"/>
+          <w:color w:val="FFFFFF" w:themeColor="background1"/>
+          <w:shd w:val="clear" w:color="auto" w:fill="000000"/>
+        </w:rPr>
+      </w:pPr>
+      <w:r>
+        <w:rPr>
+          <w:rFonts w:ascii="Aptos" w:eastAsia="Aptos" w:hAnsi="Aptos" w:cs="Aptos"/>
+          <w:color w:val="FFFFFF" w:themeColor="background1"/>
           <w:shd w:val="clear" w:color="auto" w:fill="000000"/>
         </w:rPr>
         <w:t xml:space="preserve">  "items": [</w:t>
@@ -19783,12 +19847,14 @@
       <w:pPr>
         <w:rPr>
           <w:rFonts w:ascii="Aptos" w:eastAsia="Aptos" w:hAnsi="Aptos" w:cs="Aptos"/>
-          <w:shd w:val="clear" w:color="auto" w:fill="000000"/>
-        </w:rPr>
-      </w:pPr>
-      <w:r>
-        <w:rPr>
-          <w:rFonts w:ascii="Aptos" w:eastAsia="Aptos" w:hAnsi="Aptos" w:cs="Aptos"/>
+          <w:color w:val="FFFFFF" w:themeColor="background1"/>
+          <w:shd w:val="clear" w:color="auto" w:fill="000000"/>
+        </w:rPr>
+      </w:pPr>
+      <w:r>
+        <w:rPr>
+          <w:rFonts w:ascii="Aptos" w:eastAsia="Aptos" w:hAnsi="Aptos" w:cs="Aptos"/>
+          <w:color w:val="FFFFFF" w:themeColor="background1"/>
           <w:shd w:val="clear" w:color="auto" w:fill="000000"/>
         </w:rPr>
         <w:t xml:space="preserve">    </w:t>
@@ -19797,6 +19863,7 @@
       <w:r>
         <w:rPr>
           <w:rFonts w:ascii="Aptos" w:eastAsia="Aptos" w:hAnsi="Aptos" w:cs="Aptos"/>
+          <w:color w:val="FFFFFF" w:themeColor="background1"/>
           <w:shd w:val="clear" w:color="auto" w:fill="000000"/>
         </w:rPr>
         <w:t>{ "</w:t>
@@ -19805,6 +19872,7 @@
       <w:r>
         <w:rPr>
           <w:rFonts w:ascii="Aptos" w:eastAsia="Aptos" w:hAnsi="Aptos" w:cs="Aptos"/>
+          <w:color w:val="FFFFFF" w:themeColor="background1"/>
           <w:shd w:val="clear" w:color="auto" w:fill="000000"/>
         </w:rPr>
         <w:t xml:space="preserve">name": "Espresso", "category": "Coffee", "price": </w:t>
@@ -19813,6 +19881,7 @@
       <w:r>
         <w:rPr>
           <w:rFonts w:ascii="Aptos" w:eastAsia="Aptos" w:hAnsi="Aptos" w:cs="Aptos"/>
+          <w:color w:val="FFFFFF" w:themeColor="background1"/>
           <w:shd w:val="clear" w:color="auto" w:fill="000000"/>
         </w:rPr>
         <w:t>2.5 }</w:t>
@@ -19821,6 +19890,7 @@
       <w:r>
         <w:rPr>
           <w:rFonts w:ascii="Aptos" w:eastAsia="Aptos" w:hAnsi="Aptos" w:cs="Aptos"/>
+          <w:color w:val="FFFFFF" w:themeColor="background1"/>
           <w:shd w:val="clear" w:color="auto" w:fill="000000"/>
         </w:rPr>
         <w:t>,</w:t>
@@ -19830,12 +19900,14 @@
       <w:pPr>
         <w:rPr>
           <w:rFonts w:ascii="Aptos" w:eastAsia="Aptos" w:hAnsi="Aptos" w:cs="Aptos"/>
-          <w:shd w:val="clear" w:color="auto" w:fill="000000"/>
-        </w:rPr>
-      </w:pPr>
-      <w:r>
-        <w:rPr>
-          <w:rFonts w:ascii="Aptos" w:eastAsia="Aptos" w:hAnsi="Aptos" w:cs="Aptos"/>
+          <w:color w:val="FFFFFF" w:themeColor="background1"/>
+          <w:shd w:val="clear" w:color="auto" w:fill="000000"/>
+        </w:rPr>
+      </w:pPr>
+      <w:r>
+        <w:rPr>
+          <w:rFonts w:ascii="Aptos" w:eastAsia="Aptos" w:hAnsi="Aptos" w:cs="Aptos"/>
+          <w:color w:val="FFFFFF" w:themeColor="background1"/>
           <w:shd w:val="clear" w:color="auto" w:fill="000000"/>
         </w:rPr>
         <w:t xml:space="preserve">    </w:t>
@@ -19844,6 +19916,7 @@
       <w:r>
         <w:rPr>
           <w:rFonts w:ascii="Aptos" w:eastAsia="Aptos" w:hAnsi="Aptos" w:cs="Aptos"/>
+          <w:color w:val="FFFFFF" w:themeColor="background1"/>
           <w:shd w:val="clear" w:color="auto" w:fill="000000"/>
         </w:rPr>
         <w:t>{ "</w:t>
@@ -19852,6 +19925,7 @@
       <w:r>
         <w:rPr>
           <w:rFonts w:ascii="Aptos" w:eastAsia="Aptos" w:hAnsi="Aptos" w:cs="Aptos"/>
+          <w:color w:val="FFFFFF" w:themeColor="background1"/>
           <w:shd w:val="clear" w:color="auto" w:fill="000000"/>
         </w:rPr>
         <w:t xml:space="preserve">name": "Draft Beer 500ml", "category": "Beer", "price": </w:t>
@@ -19860,6 +19934,7 @@
       <w:r>
         <w:rPr>
           <w:rFonts w:ascii="Aptos" w:eastAsia="Aptos" w:hAnsi="Aptos" w:cs="Aptos"/>
+          <w:color w:val="FFFFFF" w:themeColor="background1"/>
           <w:shd w:val="clear" w:color="auto" w:fill="000000"/>
         </w:rPr>
         <w:t>4.5 }</w:t>
@@ -19868,6 +19943,7 @@
       <w:r>
         <w:rPr>
           <w:rFonts w:ascii="Aptos" w:eastAsia="Aptos" w:hAnsi="Aptos" w:cs="Aptos"/>
+          <w:color w:val="FFFFFF" w:themeColor="background1"/>
           <w:shd w:val="clear" w:color="auto" w:fill="000000"/>
         </w:rPr>
         <w:t>,</w:t>
@@ -19877,12 +19953,14 @@
       <w:pPr>
         <w:rPr>
           <w:rFonts w:ascii="Aptos" w:eastAsia="Aptos" w:hAnsi="Aptos" w:cs="Aptos"/>
-          <w:shd w:val="clear" w:color="auto" w:fill="000000"/>
-        </w:rPr>
-      </w:pPr>
-      <w:r>
-        <w:rPr>
-          <w:rFonts w:ascii="Aptos" w:eastAsia="Aptos" w:hAnsi="Aptos" w:cs="Aptos"/>
+          <w:color w:val="FFFFFF" w:themeColor="background1"/>
+          <w:shd w:val="clear" w:color="auto" w:fill="000000"/>
+        </w:rPr>
+      </w:pPr>
+      <w:r>
+        <w:rPr>
+          <w:rFonts w:ascii="Aptos" w:eastAsia="Aptos" w:hAnsi="Aptos" w:cs="Aptos"/>
+          <w:color w:val="FFFFFF" w:themeColor="background1"/>
           <w:shd w:val="clear" w:color="auto" w:fill="000000"/>
         </w:rPr>
         <w:t xml:space="preserve">    </w:t>
@@ -19891,6 +19969,7 @@
       <w:r>
         <w:rPr>
           <w:rFonts w:ascii="Aptos" w:eastAsia="Aptos" w:hAnsi="Aptos" w:cs="Aptos"/>
+          <w:color w:val="FFFFFF" w:themeColor="background1"/>
           <w:shd w:val="clear" w:color="auto" w:fill="000000"/>
         </w:rPr>
         <w:t>{ "</w:t>
@@ -19899,6 +19978,7 @@
       <w:r>
         <w:rPr>
           <w:rFonts w:ascii="Aptos" w:eastAsia="Aptos" w:hAnsi="Aptos" w:cs="Aptos"/>
+          <w:color w:val="FFFFFF" w:themeColor="background1"/>
           <w:shd w:val="clear" w:color="auto" w:fill="000000"/>
         </w:rPr>
         <w:t xml:space="preserve">name": "Water", "category": "Soft", "price": </w:t>
@@ -19907,6 +19987,7 @@
       <w:r>
         <w:rPr>
           <w:rFonts w:ascii="Aptos" w:eastAsia="Aptos" w:hAnsi="Aptos" w:cs="Aptos"/>
+          <w:color w:val="FFFFFF" w:themeColor="background1"/>
           <w:shd w:val="clear" w:color="auto" w:fill="000000"/>
         </w:rPr>
         <w:t>1.0 }</w:t>
@@ -19917,12 +19998,14 @@
       <w:pPr>
         <w:rPr>
           <w:rFonts w:ascii="Aptos" w:eastAsia="Aptos" w:hAnsi="Aptos" w:cs="Aptos"/>
-          <w:shd w:val="clear" w:color="auto" w:fill="000000"/>
-        </w:rPr>
-      </w:pPr>
-      <w:r>
-        <w:rPr>
-          <w:rFonts w:ascii="Aptos" w:eastAsia="Aptos" w:hAnsi="Aptos" w:cs="Aptos"/>
+          <w:color w:val="FFFFFF" w:themeColor="background1"/>
+          <w:shd w:val="clear" w:color="auto" w:fill="000000"/>
+        </w:rPr>
+      </w:pPr>
+      <w:r>
+        <w:rPr>
+          <w:rFonts w:ascii="Aptos" w:eastAsia="Aptos" w:hAnsi="Aptos" w:cs="Aptos"/>
+          <w:color w:val="FFFFFF" w:themeColor="background1"/>
           <w:shd w:val="clear" w:color="auto" w:fill="000000"/>
         </w:rPr>
         <w:t xml:space="preserve">  ]</w:t>
@@ -19932,12 +20015,14 @@
       <w:pPr>
         <w:rPr>
           <w:rFonts w:ascii="Aptos" w:eastAsia="Aptos" w:hAnsi="Aptos" w:cs="Aptos"/>
-          <w:shd w:val="clear" w:color="auto" w:fill="000000"/>
-        </w:rPr>
-      </w:pPr>
-      <w:r>
-        <w:rPr>
-          <w:rFonts w:ascii="Aptos" w:eastAsia="Aptos" w:hAnsi="Aptos" w:cs="Aptos"/>
+          <w:color w:val="FFFFFF" w:themeColor="background1"/>
+          <w:shd w:val="clear" w:color="auto" w:fill="000000"/>
+        </w:rPr>
+      </w:pPr>
+      <w:r>
+        <w:rPr>
+          <w:rFonts w:ascii="Aptos" w:eastAsia="Aptos" w:hAnsi="Aptos" w:cs="Aptos"/>
+          <w:color w:val="FFFFFF" w:themeColor="background1"/>
           <w:shd w:val="clear" w:color="auto" w:fill="000000"/>
         </w:rPr>
         <w:lastRenderedPageBreak/>
@@ -20628,15 +20713,15 @@
         <w:rPr>
           <w:rFonts w:ascii="Aptos" w:eastAsia="Aptos" w:hAnsi="Aptos" w:cs="Aptos"/>
           <w:b/>
-          <w:lang w:val="en-GB"/>
-        </w:rPr>
-      </w:pPr>
-    </w:p>
-    <w:p>
-      <w:pPr>
-        <w:rPr>
-          <w:rFonts w:ascii="Times New Roman" w:eastAsia="Calibri" w:hAnsi="Times New Roman" w:cs="Times New Roman"/>
-          <w:lang w:val="en-GB"/>
+          <w:lang w:val="el-GR"/>
+        </w:rPr>
+      </w:pPr>
+    </w:p>
+    <w:p>
+      <w:pPr>
+        <w:rPr>
+          <w:rFonts w:ascii="Times New Roman" w:eastAsia="Calibri" w:hAnsi="Times New Roman" w:cs="Times New Roman"/>
+          <w:lang w:val="el-GR"/>
         </w:rPr>
       </w:pPr>
       <w:r>
@@ -21038,7 +21123,7 @@
         <w:rPr>
           <w:rFonts w:ascii="Aptos" w:eastAsia="Aptos" w:hAnsi="Aptos" w:cs="Aptos"/>
           <w:b/>
-          <w:lang w:val="en-GB"/>
+          <w:lang w:val="el-GR"/>
         </w:rPr>
       </w:pPr>
     </w:p>
@@ -25780,6 +25865,7 @@
           <w:rFonts w:ascii="Times New Roman" w:hAnsi="Times New Roman" w:cs="Times New Roman"/>
           <w:b/>
           <w:bCs/>
+          <w:lang w:val="el-GR"/>
         </w:rPr>
       </w:pPr>
       <w:bookmarkStart w:id="29" w:name="_Toc229914660"/>
@@ -25789,55 +25875,18 @@
           <w:b/>
           <w:bCs/>
         </w:rPr>
-        <w:t>A.4.1 Κα</w:t>
-      </w:r>
-      <w:proofErr w:type="spellStart"/>
+        <w:t>A</w:t>
+      </w:r>
       <w:r>
         <w:rPr>
           <w:rFonts w:ascii="Times New Roman" w:hAnsi="Times New Roman" w:cs="Times New Roman"/>
           <w:b/>
           <w:bCs/>
-        </w:rPr>
-        <w:t>τάστ</w:t>
-      </w:r>
-      <w:proofErr w:type="spellEnd"/>
-      <w:r>
-        <w:rPr>
-          <w:rFonts w:ascii="Times New Roman" w:hAnsi="Times New Roman" w:cs="Times New Roman"/>
-          <w:b/>
-          <w:bCs/>
-        </w:rPr>
-        <w:t>αση τα</w:t>
-      </w:r>
-      <w:proofErr w:type="spellStart"/>
-      <w:r>
-        <w:rPr>
-          <w:rFonts w:ascii="Times New Roman" w:hAnsi="Times New Roman" w:cs="Times New Roman"/>
-          <w:b/>
-          <w:bCs/>
-        </w:rPr>
-        <w:t>μείου</w:t>
-      </w:r>
-      <w:proofErr w:type="spellEnd"/>
-      <w:r>
-        <w:rPr>
-          <w:rFonts w:ascii="Times New Roman" w:hAnsi="Times New Roman" w:cs="Times New Roman"/>
-          <w:b/>
-          <w:bCs/>
-        </w:rPr>
-        <w:t xml:space="preserve"> και </w:t>
-      </w:r>
-      <w:proofErr w:type="spellStart"/>
-      <w:r>
-        <w:rPr>
-          <w:rFonts w:ascii="Times New Roman" w:hAnsi="Times New Roman" w:cs="Times New Roman"/>
-          <w:b/>
-          <w:bCs/>
-        </w:rPr>
-        <w:t>εκκρεμοτήτων</w:t>
+          <w:lang w:val="el-GR"/>
+        </w:rPr>
+        <w:t>.4.1 Κατάσταση ταμείου και εκκρεμοτήτων</w:t>
       </w:r>
       <w:bookmarkEnd w:id="29"/>
-      <w:proofErr w:type="spellEnd"/>
     </w:p>
     <w:p>
       <w:pPr>
@@ -26793,6 +26842,7 @@
           <w:rFonts w:ascii="Times New Roman" w:eastAsia="Calibri" w:hAnsi="Times New Roman" w:cs="Times New Roman"/>
           <w:b/>
           <w:bCs/>
+          <w:lang w:val="el-GR"/>
         </w:rPr>
       </w:pPr>
       <w:bookmarkStart w:id="33" w:name="_Toc229914664"/>
@@ -26836,7 +26886,7 @@
       <w:pPr>
         <w:rPr>
           <w:rFonts w:ascii="Times New Roman" w:eastAsia="Calibri" w:hAnsi="Times New Roman" w:cs="Times New Roman"/>
-          <w:lang w:val="en-GB"/>
+          <w:lang w:val="el-GR"/>
         </w:rPr>
       </w:pPr>
       <w:r>
@@ -27024,7 +27074,7 @@
       <w:pPr>
         <w:rPr>
           <w:rFonts w:ascii="Times New Roman" w:eastAsia="Calibri" w:hAnsi="Times New Roman" w:cs="Times New Roman"/>
-          <w:lang w:val="en-GB"/>
+          <w:lang w:val="el-GR"/>
         </w:rPr>
       </w:pPr>
     </w:p>
@@ -27035,6 +27085,7 @@
           <w:rFonts w:ascii="Times New Roman" w:eastAsia="Calibri" w:hAnsi="Times New Roman" w:cs="Times New Roman"/>
           <w:b/>
           <w:bCs/>
+          <w:lang w:val="el-GR"/>
         </w:rPr>
       </w:pPr>
       <w:bookmarkStart w:id="34" w:name="_Toc229914665"/>
@@ -27116,7 +27167,7 @@
       <w:pPr>
         <w:rPr>
           <w:rFonts w:ascii="Times New Roman" w:eastAsia="Calibri" w:hAnsi="Times New Roman" w:cs="Times New Roman"/>
-          <w:lang w:val="en-GB"/>
+          <w:lang w:val="el-GR"/>
         </w:rPr>
       </w:pPr>
       <w:r>
@@ -27129,6 +27180,7 @@
       <w:r>
         <w:rPr>
           <w:rFonts w:ascii="Times New Roman" w:eastAsia="Calibri" w:hAnsi="Times New Roman" w:cs="Times New Roman"/>
+          <w:lang w:val="el-GR"/>
         </w:rPr>
         <w:t xml:space="preserve"> </w:t>
       </w:r>
@@ -27142,6 +27194,7 @@
       <w:r>
         <w:rPr>
           <w:rFonts w:ascii="Times New Roman" w:eastAsia="Calibri" w:hAnsi="Times New Roman" w:cs="Times New Roman"/>
+          <w:lang w:val="el-GR"/>
         </w:rPr>
         <w:t xml:space="preserve"> </w:t>
       </w:r>
@@ -27155,6 +27208,7 @@
       <w:r>
         <w:rPr>
           <w:rFonts w:ascii="Times New Roman" w:eastAsia="Calibri" w:hAnsi="Times New Roman" w:cs="Times New Roman"/>
+          <w:lang w:val="el-GR"/>
         </w:rPr>
         <w:t xml:space="preserve"> </w:t>
       </w:r>
@@ -27168,6 +27222,7 @@
       <w:r>
         <w:rPr>
           <w:rFonts w:ascii="Times New Roman" w:eastAsia="Calibri" w:hAnsi="Times New Roman" w:cs="Times New Roman"/>
+          <w:lang w:val="el-GR"/>
         </w:rPr>
         <w:t xml:space="preserve"> </w:t>
       </w:r>
@@ -27181,6 +27236,7 @@
       <w:r>
         <w:rPr>
           <w:rFonts w:ascii="Times New Roman" w:eastAsia="Calibri" w:hAnsi="Times New Roman" w:cs="Times New Roman"/>
+          <w:lang w:val="el-GR"/>
         </w:rPr>
         <w:t xml:space="preserve"> </w:t>
       </w:r>
@@ -27194,8 +27250,22 @@
       <w:r>
         <w:rPr>
           <w:rFonts w:ascii="Times New Roman" w:eastAsia="Calibri" w:hAnsi="Times New Roman" w:cs="Times New Roman"/>
-        </w:rPr>
-        <w:t xml:space="preserve"> SQLite </w:t>
+          <w:lang w:val="el-GR"/>
+        </w:rPr>
+        <w:t xml:space="preserve"> </w:t>
+      </w:r>
+      <w:r>
+        <w:rPr>
+          <w:rFonts w:ascii="Times New Roman" w:eastAsia="Calibri" w:hAnsi="Times New Roman" w:cs="Times New Roman"/>
+        </w:rPr>
+        <w:t>SQLite</w:t>
+      </w:r>
+      <w:r>
+        <w:rPr>
+          <w:rFonts w:ascii="Times New Roman" w:eastAsia="Calibri" w:hAnsi="Times New Roman" w:cs="Times New Roman"/>
+          <w:lang w:val="el-GR"/>
+        </w:rPr>
+        <w:t xml:space="preserve"> </w:t>
       </w:r>
       <w:r>
         <w:rPr>
@@ -27207,6 +27277,7 @@
       <w:r>
         <w:rPr>
           <w:rFonts w:ascii="Times New Roman" w:eastAsia="Calibri" w:hAnsi="Times New Roman" w:cs="Times New Roman"/>
+          <w:lang w:val="el-GR"/>
         </w:rPr>
         <w:t xml:space="preserve"> </w:t>
       </w:r>
@@ -27220,6 +27291,7 @@
       <w:r>
         <w:rPr>
           <w:rFonts w:ascii="Times New Roman" w:eastAsia="Calibri" w:hAnsi="Times New Roman" w:cs="Times New Roman"/>
+          <w:lang w:val="el-GR"/>
         </w:rPr>
         <w:t xml:space="preserve"> </w:t>
       </w:r>
@@ -27234,6 +27306,7 @@
       <w:r>
         <w:rPr>
           <w:rFonts w:ascii="Times New Roman" w:eastAsia="Calibri" w:hAnsi="Times New Roman" w:cs="Times New Roman"/>
+          <w:lang w:val="el-GR"/>
         </w:rPr>
         <w:t xml:space="preserve">, </w:t>
       </w:r>
@@ -27247,6 +27320,7 @@
       <w:r>
         <w:rPr>
           <w:rFonts w:ascii="Times New Roman" w:eastAsia="Calibri" w:hAnsi="Times New Roman" w:cs="Times New Roman"/>
+          <w:lang w:val="el-GR"/>
         </w:rPr>
         <w:t xml:space="preserve"> </w:t>
       </w:r>
@@ -27260,8 +27334,100 @@
       <w:r>
         <w:rPr>
           <w:rFonts w:ascii="Times New Roman" w:eastAsia="Calibri" w:hAnsi="Times New Roman" w:cs="Times New Roman"/>
-        </w:rPr>
-        <w:t xml:space="preserve">: Id (Primary Key), Name, Category, Price, Active </w:t>
+          <w:lang w:val="el-GR"/>
+        </w:rPr>
+        <w:t xml:space="preserve">: </w:t>
+      </w:r>
+      <w:r>
+        <w:rPr>
+          <w:rFonts w:ascii="Times New Roman" w:eastAsia="Calibri" w:hAnsi="Times New Roman" w:cs="Times New Roman"/>
+        </w:rPr>
+        <w:t>Id</w:t>
+      </w:r>
+      <w:r>
+        <w:rPr>
+          <w:rFonts w:ascii="Times New Roman" w:eastAsia="Calibri" w:hAnsi="Times New Roman" w:cs="Times New Roman"/>
+          <w:lang w:val="el-GR"/>
+        </w:rPr>
+        <w:t xml:space="preserve"> (</w:t>
+      </w:r>
+      <w:r>
+        <w:rPr>
+          <w:rFonts w:ascii="Times New Roman" w:eastAsia="Calibri" w:hAnsi="Times New Roman" w:cs="Times New Roman"/>
+        </w:rPr>
+        <w:t>Primary</w:t>
+      </w:r>
+      <w:r>
+        <w:rPr>
+          <w:rFonts w:ascii="Times New Roman" w:eastAsia="Calibri" w:hAnsi="Times New Roman" w:cs="Times New Roman"/>
+          <w:lang w:val="el-GR"/>
+        </w:rPr>
+        <w:t xml:space="preserve"> </w:t>
+      </w:r>
+      <w:r>
+        <w:rPr>
+          <w:rFonts w:ascii="Times New Roman" w:eastAsia="Calibri" w:hAnsi="Times New Roman" w:cs="Times New Roman"/>
+        </w:rPr>
+        <w:t>Key</w:t>
+      </w:r>
+      <w:r>
+        <w:rPr>
+          <w:rFonts w:ascii="Times New Roman" w:eastAsia="Calibri" w:hAnsi="Times New Roman" w:cs="Times New Roman"/>
+          <w:lang w:val="el-GR"/>
+        </w:rPr>
+        <w:t xml:space="preserve">), </w:t>
+      </w:r>
+      <w:r>
+        <w:rPr>
+          <w:rFonts w:ascii="Times New Roman" w:eastAsia="Calibri" w:hAnsi="Times New Roman" w:cs="Times New Roman"/>
+        </w:rPr>
+        <w:t>Name</w:t>
+      </w:r>
+      <w:r>
+        <w:rPr>
+          <w:rFonts w:ascii="Times New Roman" w:eastAsia="Calibri" w:hAnsi="Times New Roman" w:cs="Times New Roman"/>
+          <w:lang w:val="el-GR"/>
+        </w:rPr>
+        <w:t xml:space="preserve">, </w:t>
+      </w:r>
+      <w:r>
+        <w:rPr>
+          <w:rFonts w:ascii="Times New Roman" w:eastAsia="Calibri" w:hAnsi="Times New Roman" w:cs="Times New Roman"/>
+        </w:rPr>
+        <w:t>Category</w:t>
+      </w:r>
+      <w:r>
+        <w:rPr>
+          <w:rFonts w:ascii="Times New Roman" w:eastAsia="Calibri" w:hAnsi="Times New Roman" w:cs="Times New Roman"/>
+          <w:lang w:val="el-GR"/>
+        </w:rPr>
+        <w:t xml:space="preserve">, </w:t>
+      </w:r>
+      <w:r>
+        <w:rPr>
+          <w:rFonts w:ascii="Times New Roman" w:eastAsia="Calibri" w:hAnsi="Times New Roman" w:cs="Times New Roman"/>
+        </w:rPr>
+        <w:t>Price</w:t>
+      </w:r>
+      <w:r>
+        <w:rPr>
+          <w:rFonts w:ascii="Times New Roman" w:eastAsia="Calibri" w:hAnsi="Times New Roman" w:cs="Times New Roman"/>
+          <w:lang w:val="el-GR"/>
+        </w:rPr>
+        <w:t xml:space="preserve">, </w:t>
+      </w:r>
+      <w:r>
+        <w:rPr>
+          <w:rFonts w:ascii="Times New Roman" w:eastAsia="Calibri" w:hAnsi="Times New Roman" w:cs="Times New Roman"/>
+        </w:rPr>
+        <w:t>Active</w:t>
+      </w:r>
+      <w:r>
+        <w:rPr>
+          <w:rFonts w:ascii="Times New Roman" w:eastAsia="Calibri" w:hAnsi="Times New Roman" w:cs="Times New Roman"/>
+          <w:lang w:val="el-GR"/>
+        </w:rPr>
+        <w:t xml:space="preserve"> </w:t>
       </w:r>
       <w:r>
         <w:rPr>
@@ -27273,6 +27439,7 @@
       <w:r>
         <w:rPr>
           <w:rFonts w:ascii="Times New Roman" w:eastAsia="Calibri" w:hAnsi="Times New Roman" w:cs="Times New Roman"/>
+          <w:lang w:val="el-GR"/>
         </w:rPr>
         <w:t xml:space="preserve"> </w:t>
       </w:r>
@@ -27287,6 +27454,7 @@
       <w:r>
         <w:rPr>
           <w:rFonts w:ascii="Times New Roman" w:eastAsia="Calibri" w:hAnsi="Times New Roman" w:cs="Times New Roman"/>
+          <w:lang w:val="el-GR"/>
         </w:rPr>
         <w:t xml:space="preserve">. </w:t>
       </w:r>
@@ -27369,7 +27537,7 @@
       <w:pPr>
         <w:rPr>
           <w:rFonts w:ascii="Times New Roman" w:eastAsia="Calibri" w:hAnsi="Times New Roman" w:cs="Times New Roman"/>
-          <w:lang w:val="en-GB"/>
+          <w:lang w:val="el-GR"/>
         </w:rPr>
       </w:pPr>
     </w:p>
@@ -27380,7 +27548,7 @@
           <w:rFonts w:ascii="Times New Roman" w:eastAsia="Calibri" w:hAnsi="Times New Roman" w:cs="Times New Roman"/>
           <w:b/>
           <w:bCs/>
-          <w:lang w:val="en-GB"/>
+          <w:lang w:val="el-GR"/>
         </w:rPr>
       </w:pPr>
       <w:bookmarkStart w:id="35" w:name="_Toc229914666"/>
@@ -27687,7 +27855,7 @@
       <w:pPr>
         <w:rPr>
           <w:rFonts w:ascii="Times New Roman" w:eastAsia="Calibri" w:hAnsi="Times New Roman" w:cs="Times New Roman"/>
-          <w:lang w:val="en-GB"/>
+          <w:lang w:val="el-GR"/>
         </w:rPr>
       </w:pPr>
       <w:r>
@@ -27832,7 +28000,7 @@
       <w:pPr>
         <w:rPr>
           <w:rFonts w:ascii="Times New Roman" w:eastAsia="Calibri" w:hAnsi="Times New Roman" w:cs="Times New Roman"/>
-          <w:lang w:val="en-GB"/>
+          <w:lang w:val="el-GR"/>
         </w:rPr>
       </w:pPr>
     </w:p>
@@ -27843,7 +28011,7 @@
           <w:rFonts w:ascii="Times New Roman" w:eastAsia="Calibri" w:hAnsi="Times New Roman" w:cs="Times New Roman"/>
           <w:b/>
           <w:bCs/>
-          <w:lang w:val="en-GB"/>
+          <w:lang w:val="el-GR"/>
         </w:rPr>
       </w:pPr>
       <w:bookmarkStart w:id="36" w:name="_Toc229914667"/>
@@ -28768,6 +28936,7 @@
           <w:rFonts w:ascii="Times New Roman" w:eastAsia="Calibri" w:hAnsi="Times New Roman" w:cs="Times New Roman"/>
           <w:b/>
           <w:bCs/>
+          <w:lang w:val="el-GR"/>
         </w:rPr>
       </w:pPr>
       <w:bookmarkStart w:id="37" w:name="_Toc229914668"/>
@@ -29210,7 +29379,7 @@
       <w:pPr>
         <w:rPr>
           <w:rFonts w:ascii="Times New Roman" w:eastAsia="Calibri" w:hAnsi="Times New Roman" w:cs="Times New Roman"/>
-          <w:lang w:val="en-GB"/>
+          <w:lang w:val="el-GR"/>
         </w:rPr>
       </w:pPr>
       <w:r>
@@ -29342,7 +29511,7 @@
       <w:pPr>
         <w:rPr>
           <w:rFonts w:ascii="Times New Roman" w:eastAsia="Calibri" w:hAnsi="Times New Roman" w:cs="Times New Roman"/>
-          <w:lang w:val="en-GB"/>
+          <w:lang w:val="el-GR"/>
         </w:rPr>
       </w:pPr>
     </w:p>
@@ -29353,7 +29522,7 @@
           <w:rFonts w:ascii="Times New Roman" w:eastAsia="Calibri" w:hAnsi="Times New Roman" w:cs="Times New Roman"/>
           <w:b/>
           <w:bCs/>
-          <w:lang w:val="en-GB"/>
+          <w:lang w:val="el-GR"/>
         </w:rPr>
       </w:pPr>
       <w:bookmarkStart w:id="38" w:name="_Toc229914669"/>
@@ -29389,7 +29558,7 @@
       <w:pPr>
         <w:rPr>
           <w:rFonts w:ascii="Times New Roman" w:eastAsia="Calibri" w:hAnsi="Times New Roman" w:cs="Times New Roman"/>
-          <w:lang w:val="en-GB"/>
+          <w:lang w:val="el-GR"/>
         </w:rPr>
       </w:pPr>
       <w:r>
@@ -29770,7 +29939,7 @@
           <w:rFonts w:ascii="Times New Roman" w:eastAsia="Calibri" w:hAnsi="Times New Roman" w:cs="Times New Roman"/>
           <w:b/>
           <w:bCs/>
-          <w:lang w:val="en-GB"/>
+          <w:lang w:val="el-GR"/>
         </w:rPr>
       </w:pPr>
       <w:bookmarkStart w:id="40" w:name="_Toc229914671"/>
@@ -30292,7 +30461,7 @@
       <w:pPr>
         <w:rPr>
           <w:rFonts w:ascii="Times New Roman" w:eastAsia="Calibri" w:hAnsi="Times New Roman" w:cs="Times New Roman"/>
-          <w:lang w:val="en-GB"/>
+          <w:lang w:val="el-GR"/>
         </w:rPr>
       </w:pPr>
       <w:r>
@@ -30437,7 +30606,7 @@
       <w:pPr>
         <w:rPr>
           <w:rFonts w:ascii="Times New Roman" w:eastAsia="Calibri" w:hAnsi="Times New Roman" w:cs="Times New Roman"/>
-          <w:lang w:val="en-GB"/>
+          <w:lang w:val="el-GR"/>
         </w:rPr>
       </w:pPr>
     </w:p>
@@ -30448,7 +30617,7 @@
           <w:rFonts w:ascii="Times New Roman" w:eastAsia="Aptos" w:hAnsi="Times New Roman" w:cs="Times New Roman"/>
           <w:b/>
           <w:bCs/>
-          <w:lang w:val="en-GB"/>
+          <w:lang w:val="el-GR"/>
         </w:rPr>
       </w:pPr>
       <w:bookmarkStart w:id="41" w:name="_Toc229914672"/>
@@ -30467,7 +30636,7 @@
           <w:rFonts w:ascii="Times New Roman" w:eastAsia="Calibri" w:hAnsi="Times New Roman" w:cs="Times New Roman"/>
           <w:b/>
           <w:bCs/>
-          <w:lang w:val="en-GB"/>
+          <w:lang w:val="el-GR"/>
         </w:rPr>
         <w:t xml:space="preserve">.2 </w:t>
       </w:r>
@@ -30485,7 +30654,7 @@
           <w:rFonts w:ascii="Times New Roman" w:eastAsia="Calibri" w:hAnsi="Times New Roman" w:cs="Times New Roman"/>
           <w:b/>
           <w:bCs/>
-          <w:lang w:val="en-GB"/>
+          <w:lang w:val="el-GR"/>
         </w:rPr>
         <w:t xml:space="preserve"> </w:t>
       </w:r>
@@ -30503,7 +30672,7 @@
           <w:rFonts w:ascii="Times New Roman" w:eastAsia="Calibri" w:hAnsi="Times New Roman" w:cs="Times New Roman"/>
           <w:b/>
           <w:bCs/>
-          <w:lang w:val="en-GB"/>
+          <w:lang w:val="el-GR"/>
         </w:rPr>
         <w:t xml:space="preserve"> </w:t>
       </w:r>
@@ -30521,7 +30690,7 @@
           <w:rFonts w:ascii="Times New Roman" w:eastAsia="Calibri" w:hAnsi="Times New Roman" w:cs="Times New Roman"/>
           <w:b/>
           <w:bCs/>
-          <w:lang w:val="en-GB"/>
+          <w:lang w:val="el-GR"/>
         </w:rPr>
         <w:t xml:space="preserve"> </w:t>
       </w:r>
@@ -30539,7 +30708,7 @@
           <w:rFonts w:ascii="Times New Roman" w:eastAsia="Calibri" w:hAnsi="Times New Roman" w:cs="Times New Roman"/>
           <w:b/>
           <w:bCs/>
-          <w:lang w:val="en-GB"/>
+          <w:lang w:val="el-GR"/>
         </w:rPr>
         <w:t xml:space="preserve"> (</w:t>
       </w:r>
@@ -30556,7 +30725,7 @@
           <w:rFonts w:ascii="Times New Roman" w:eastAsia="Calibri" w:hAnsi="Times New Roman" w:cs="Times New Roman"/>
           <w:b/>
           <w:bCs/>
-          <w:lang w:val="en-GB"/>
+          <w:lang w:val="el-GR"/>
         </w:rPr>
         <w:t xml:space="preserve"> </w:t>
       </w:r>
@@ -30565,7 +30734,7 @@
           <w:rFonts w:ascii="Times New Roman" w:eastAsia="Cambria Math" w:hAnsi="Times New Roman" w:cs="Times New Roman"/>
           <w:b/>
           <w:bCs/>
-          <w:lang w:val="en-GB"/>
+          <w:lang w:val="el-GR"/>
         </w:rPr>
         <w:t>→</w:t>
       </w:r>
@@ -30574,7 +30743,7 @@
           <w:rFonts w:ascii="Times New Roman" w:eastAsia="Aptos" w:hAnsi="Times New Roman" w:cs="Times New Roman"/>
           <w:b/>
           <w:bCs/>
-          <w:lang w:val="en-GB"/>
+          <w:lang w:val="el-GR"/>
         </w:rPr>
         <w:t xml:space="preserve"> </w:t>
       </w:r>
@@ -30591,7 +30760,7 @@
           <w:rFonts w:ascii="Times New Roman" w:eastAsia="Aptos" w:hAnsi="Times New Roman" w:cs="Times New Roman"/>
           <w:b/>
           <w:bCs/>
-          <w:lang w:val="en-GB"/>
+          <w:lang w:val="el-GR"/>
         </w:rPr>
         <w:t xml:space="preserve"> </w:t>
       </w:r>
@@ -30600,7 +30769,7 @@
           <w:rFonts w:ascii="Times New Roman" w:eastAsia="Cambria Math" w:hAnsi="Times New Roman" w:cs="Times New Roman"/>
           <w:b/>
           <w:bCs/>
-          <w:lang w:val="en-GB"/>
+          <w:lang w:val="el-GR"/>
         </w:rPr>
         <w:t>→</w:t>
       </w:r>
@@ -30609,7 +30778,7 @@
           <w:rFonts w:ascii="Times New Roman" w:eastAsia="Aptos" w:hAnsi="Times New Roman" w:cs="Times New Roman"/>
           <w:b/>
           <w:bCs/>
-          <w:lang w:val="en-GB"/>
+          <w:lang w:val="el-GR"/>
         </w:rPr>
         <w:t xml:space="preserve"> </w:t>
       </w:r>
@@ -30626,7 +30795,7 @@
           <w:rFonts w:ascii="Times New Roman" w:eastAsia="Aptos" w:hAnsi="Times New Roman" w:cs="Times New Roman"/>
           <w:b/>
           <w:bCs/>
-          <w:lang w:val="en-GB"/>
+          <w:lang w:val="el-GR"/>
         </w:rPr>
         <w:t>/</w:t>
       </w:r>
@@ -30643,7 +30812,7 @@
           <w:rFonts w:ascii="Times New Roman" w:eastAsia="Aptos" w:hAnsi="Times New Roman" w:cs="Times New Roman"/>
           <w:b/>
           <w:bCs/>
-          <w:lang w:val="en-GB"/>
+          <w:lang w:val="el-GR"/>
         </w:rPr>
         <w:t xml:space="preserve"> </w:t>
       </w:r>
@@ -30652,7 +30821,7 @@
           <w:rFonts w:ascii="Times New Roman" w:eastAsia="Cambria Math" w:hAnsi="Times New Roman" w:cs="Times New Roman"/>
           <w:b/>
           <w:bCs/>
-          <w:lang w:val="en-GB"/>
+          <w:lang w:val="el-GR"/>
         </w:rPr>
         <w:t>→</w:t>
       </w:r>
@@ -30661,7 +30830,7 @@
           <w:rFonts w:ascii="Times New Roman" w:eastAsia="Aptos" w:hAnsi="Times New Roman" w:cs="Times New Roman"/>
           <w:b/>
           <w:bCs/>
-          <w:lang w:val="en-GB"/>
+          <w:lang w:val="el-GR"/>
         </w:rPr>
         <w:t xml:space="preserve"> </w:t>
       </w:r>
@@ -30678,7 +30847,7 @@
           <w:rFonts w:ascii="Times New Roman" w:eastAsia="Aptos" w:hAnsi="Times New Roman" w:cs="Times New Roman"/>
           <w:b/>
           <w:bCs/>
-          <w:lang w:val="en-GB"/>
+          <w:lang w:val="el-GR"/>
         </w:rPr>
         <w:t>)</w:t>
       </w:r>
@@ -31075,7 +31244,7 @@
       <w:pPr>
         <w:rPr>
           <w:rFonts w:ascii="Times New Roman" w:eastAsia="Calibri" w:hAnsi="Times New Roman" w:cs="Times New Roman"/>
-          <w:lang w:val="en-GB"/>
+          <w:lang w:val="el-GR"/>
         </w:rPr>
       </w:pPr>
       <w:r>
@@ -31317,7 +31486,7 @@
       <w:pPr>
         <w:rPr>
           <w:rFonts w:ascii="Times New Roman" w:eastAsia="Calibri" w:hAnsi="Times New Roman" w:cs="Times New Roman"/>
-          <w:lang w:val="en-GB"/>
+          <w:lang w:val="el-GR"/>
         </w:rPr>
       </w:pPr>
     </w:p>
@@ -31328,7 +31497,7 @@
           <w:rFonts w:ascii="Times New Roman" w:eastAsia="Calibri" w:hAnsi="Times New Roman" w:cs="Times New Roman"/>
           <w:b/>
           <w:bCs/>
-          <w:lang w:val="en-GB"/>
+          <w:lang w:val="el-GR"/>
         </w:rPr>
       </w:pPr>
       <w:bookmarkStart w:id="42" w:name="_Toc229914673"/>
@@ -32212,7 +32381,7 @@
       <w:pPr>
         <w:rPr>
           <w:rFonts w:ascii="Times New Roman" w:eastAsia="Aptos" w:hAnsi="Times New Roman" w:cs="Times New Roman"/>
-          <w:lang w:val="en-GB"/>
+          <w:lang w:val="el-GR"/>
         </w:rPr>
       </w:pPr>
     </w:p>
@@ -32220,7 +32389,7 @@
       <w:pPr>
         <w:rPr>
           <w:rFonts w:ascii="Times New Roman" w:eastAsia="Aptos" w:hAnsi="Times New Roman" w:cs="Times New Roman"/>
-          <w:lang w:val="en-GB"/>
+          <w:lang w:val="el-GR"/>
         </w:rPr>
       </w:pPr>
     </w:p>
@@ -32228,7 +32397,7 @@
       <w:pPr>
         <w:rPr>
           <w:rFonts w:ascii="Times New Roman" w:eastAsia="Aptos" w:hAnsi="Times New Roman" w:cs="Times New Roman"/>
-          <w:lang w:val="en-GB"/>
+          <w:lang w:val="el-GR"/>
         </w:rPr>
       </w:pPr>
     </w:p>
@@ -32236,7 +32405,7 @@
       <w:pPr>
         <w:rPr>
           <w:rFonts w:ascii="Times New Roman" w:eastAsia="Aptos" w:hAnsi="Times New Roman" w:cs="Times New Roman"/>
-          <w:lang w:val="en-GB"/>
+          <w:lang w:val="el-GR"/>
         </w:rPr>
       </w:pPr>
     </w:p>
@@ -32305,7 +32474,7 @@
           <w:rFonts w:ascii="Times New Roman" w:eastAsia="Calibri" w:hAnsi="Times New Roman" w:cs="Times New Roman"/>
           <w:b/>
           <w:bCs/>
-          <w:lang w:val="en-GB"/>
+          <w:lang w:val="el-GR"/>
         </w:rPr>
       </w:pPr>
       <w:bookmarkStart w:id="44" w:name="_Toc229914675"/>
@@ -32680,7 +32849,7 @@
       <w:pPr>
         <w:rPr>
           <w:rFonts w:ascii="Times New Roman" w:eastAsia="Calibri" w:hAnsi="Times New Roman" w:cs="Times New Roman"/>
-          <w:lang w:val="en-GB"/>
+          <w:lang w:val="el-GR"/>
         </w:rPr>
       </w:pPr>
       <w:r>
@@ -32838,7 +33007,7 @@
       <w:pPr>
         <w:rPr>
           <w:rFonts w:ascii="Times New Roman" w:eastAsia="Calibri" w:hAnsi="Times New Roman" w:cs="Times New Roman"/>
-          <w:lang w:val="en-GB"/>
+          <w:lang w:val="el-GR"/>
         </w:rPr>
       </w:pPr>
     </w:p>
@@ -32849,7 +33018,7 @@
           <w:rFonts w:ascii="Times New Roman" w:eastAsia="Calibri" w:hAnsi="Times New Roman" w:cs="Times New Roman"/>
           <w:b/>
           <w:bCs/>
-          <w:lang w:val="en-GB"/>
+          <w:lang w:val="el-GR"/>
         </w:rPr>
       </w:pPr>
       <w:bookmarkStart w:id="45" w:name="_Toc229914676"/>
@@ -33204,7 +33373,7 @@
       <w:pPr>
         <w:rPr>
           <w:rFonts w:ascii="Times New Roman" w:eastAsia="Calibri" w:hAnsi="Times New Roman" w:cs="Times New Roman"/>
-          <w:lang w:val="en-GB"/>
+          <w:lang w:val="el-GR"/>
         </w:rPr>
       </w:pPr>
       <w:r>
@@ -33416,7 +33585,7 @@
       <w:pPr>
         <w:rPr>
           <w:rFonts w:ascii="Times New Roman" w:eastAsia="Calibri" w:hAnsi="Times New Roman" w:cs="Times New Roman"/>
-          <w:lang w:val="en-GB"/>
+          <w:lang w:val="el-GR"/>
         </w:rPr>
       </w:pPr>
     </w:p>
@@ -33427,6 +33596,7 @@
           <w:rFonts w:ascii="Times New Roman" w:eastAsia="Calibri" w:hAnsi="Times New Roman" w:cs="Times New Roman"/>
           <w:b/>
           <w:bCs/>
+          <w:lang w:val="el-GR"/>
         </w:rPr>
       </w:pPr>
       <w:bookmarkStart w:id="46" w:name="_Toc229914677"/>
@@ -33699,7 +33869,7 @@
       <w:pPr>
         <w:rPr>
           <w:rFonts w:ascii="Times New Roman" w:eastAsia="Calibri" w:hAnsi="Times New Roman" w:cs="Times New Roman"/>
-          <w:lang w:val="en-GB"/>
+          <w:lang w:val="el-GR"/>
         </w:rPr>
       </w:pPr>
       <w:r>
@@ -33950,7 +34120,7 @@
       <w:pPr>
         <w:rPr>
           <w:rFonts w:ascii="Times New Roman" w:eastAsia="Calibri" w:hAnsi="Times New Roman" w:cs="Times New Roman"/>
-          <w:lang w:val="en-GB"/>
+          <w:lang w:val="el-GR"/>
         </w:rPr>
       </w:pPr>
     </w:p>
@@ -33961,6 +34131,7 @@
           <w:rFonts w:ascii="Times New Roman" w:eastAsia="Calibri" w:hAnsi="Times New Roman" w:cs="Times New Roman"/>
           <w:b/>
           <w:bCs/>
+          <w:lang w:val="el-GR"/>
         </w:rPr>
       </w:pPr>
       <w:bookmarkStart w:id="47" w:name="_Toc229914678"/>
@@ -34076,7 +34247,7 @@
       <w:pPr>
         <w:rPr>
           <w:rFonts w:ascii="Times New Roman" w:eastAsia="Calibri" w:hAnsi="Times New Roman" w:cs="Times New Roman"/>
-          <w:lang w:val="en-GB"/>
+          <w:lang w:val="el-GR"/>
         </w:rPr>
       </w:pPr>
       <w:r>
@@ -34370,7 +34541,7 @@
       <w:pPr>
         <w:rPr>
           <w:rFonts w:ascii="Times New Roman" w:eastAsia="Calibri" w:hAnsi="Times New Roman" w:cs="Times New Roman"/>
-          <w:lang w:val="en-GB"/>
+          <w:lang w:val="el-GR"/>
         </w:rPr>
       </w:pPr>
     </w:p>
@@ -34381,7 +34552,7 @@
           <w:rFonts w:ascii="Times New Roman" w:eastAsia="Calibri" w:hAnsi="Times New Roman" w:cs="Times New Roman"/>
           <w:b/>
           <w:bCs/>
-          <w:lang w:val="en-GB"/>
+          <w:lang w:val="el-GR"/>
         </w:rPr>
       </w:pPr>
       <w:bookmarkStart w:id="48" w:name="_Toc229914679"/>
@@ -34451,7 +34622,7 @@
       <w:pPr>
         <w:rPr>
           <w:rFonts w:ascii="Times New Roman" w:eastAsia="Calibri" w:hAnsi="Times New Roman" w:cs="Times New Roman"/>
-          <w:lang w:val="en-GB"/>
+          <w:lang w:val="el-GR"/>
         </w:rPr>
       </w:pPr>
       <w:r>
@@ -34583,7 +34754,7 @@
       <w:pPr>
         <w:rPr>
           <w:rFonts w:ascii="Times New Roman" w:eastAsia="Calibri" w:hAnsi="Times New Roman" w:cs="Times New Roman"/>
-          <w:lang w:val="en-GB"/>
+          <w:lang w:val="el-GR"/>
         </w:rPr>
       </w:pPr>
     </w:p>
@@ -34594,7 +34765,7 @@
           <w:rFonts w:ascii="Times New Roman" w:eastAsia="Calibri" w:hAnsi="Times New Roman" w:cs="Times New Roman"/>
           <w:b/>
           <w:bCs/>
-          <w:lang w:val="en-GB"/>
+          <w:lang w:val="el-GR"/>
         </w:rPr>
       </w:pPr>
       <w:bookmarkStart w:id="49" w:name="_Toc229914680"/>
@@ -34647,7 +34818,7 @@
       <w:pPr>
         <w:rPr>
           <w:rFonts w:ascii="Times New Roman" w:eastAsia="Calibri" w:hAnsi="Times New Roman" w:cs="Times New Roman"/>
-          <w:lang w:val="en-GB"/>
+          <w:lang w:val="el-GR"/>
         </w:rPr>
       </w:pPr>
       <w:r>
@@ -34740,7 +34911,7 @@
       <w:pPr>
         <w:rPr>
           <w:rFonts w:ascii="Times New Roman" w:eastAsia="Calibri" w:hAnsi="Times New Roman" w:cs="Times New Roman"/>
-          <w:lang w:val="en-GB"/>
+          <w:lang w:val="el-GR"/>
         </w:rPr>
       </w:pPr>
     </w:p>
@@ -34751,6 +34922,7 @@
           <w:rFonts w:ascii="Times New Roman" w:eastAsia="Calibri" w:hAnsi="Times New Roman" w:cs="Times New Roman"/>
           <w:b/>
           <w:bCs/>
+          <w:lang w:val="el-GR"/>
         </w:rPr>
       </w:pPr>
       <w:bookmarkStart w:id="50" w:name="_Toc229914681"/>
@@ -34811,7 +34983,7 @@
       <w:pPr>
         <w:rPr>
           <w:rFonts w:ascii="Times New Roman" w:eastAsia="Calibri" w:hAnsi="Times New Roman" w:cs="Times New Roman"/>
-          <w:lang w:val="en-GB"/>
+          <w:lang w:val="el-GR"/>
         </w:rPr>
       </w:pPr>
       <w:r>
@@ -34932,7 +35104,7 @@
       <w:pPr>
         <w:rPr>
           <w:rFonts w:ascii="Times New Roman" w:eastAsia="Calibri" w:hAnsi="Times New Roman" w:cs="Times New Roman"/>
-          <w:lang w:val="en-GB"/>
+          <w:lang w:val="el-GR"/>
         </w:rPr>
       </w:pPr>
     </w:p>

</xml_diff>